<commit_message>
docs: finalize English STAT3888 speech guide
</commit_message>
<xml_diff>
--- a/deliverables/STAT3888_Toronto_Bicycle_Theft_Presentation/STAT3888_五分钟演讲稿与原理解析.docx
+++ b/deliverables/STAT3888_Toronto_Bicycle_Theft_Presentation/STAT3888_五分钟演讲稿与原理解析.docx
@@ -10,7 +10,7 @@
       </w:pPr>
       <w:r>
         <w:rPr>
-          <w:rFonts w:ascii="Calibri" w:hAnsi="Calibri" w:eastAsia="Arial Unicode MS"/>
+          <w:rFonts w:ascii="Arial" w:hAnsi="Arial" w:eastAsia="Hiragino Sans GB"/>
           <w:b/>
           <w:i w:val="0"/>
           <w:color w:val="007F82"/>
@@ -27,7 +27,7 @@
       </w:pPr>
       <w:r>
         <w:rPr>
-          <w:rFonts w:ascii="Calibri" w:hAnsi="Calibri" w:eastAsia="Arial Unicode MS"/>
+          <w:rFonts w:ascii="Arial" w:hAnsi="Arial" w:eastAsia="Hiragino Sans GB"/>
           <w:b/>
           <w:i w:val="0"/>
           <w:color w:val="203748"/>
@@ -44,7 +44,7 @@
       </w:pPr>
       <w:r>
         <w:rPr>
-          <w:rFonts w:ascii="Arial Unicode MS" w:hAnsi="Arial Unicode MS" w:eastAsia="Arial Unicode MS"/>
+          <w:rFonts w:ascii="Hiragino Sans GB" w:hAnsi="Hiragino Sans GB" w:eastAsia="Hiragino Sans GB"/>
           <w:b w:val="0"/>
           <w:i w:val="0"/>
           <w:color w:val="2B5163"/>
@@ -61,7 +61,7 @@
       </w:pPr>
       <w:r>
         <w:rPr>
-          <w:rFonts w:ascii="Arial Unicode MS" w:hAnsi="Arial Unicode MS" w:eastAsia="Arial Unicode MS"/>
+          <w:rFonts w:ascii="Hiragino Sans GB" w:hAnsi="Hiragino Sans GB" w:eastAsia="Hiragino Sans GB"/>
           <w:b/>
           <w:color w:val="007F82"/>
           <w:sz w:val="18"/>
@@ -71,7 +71,7 @@
       </w:r>
       <w:r>
         <w:rPr>
-          <w:rFonts w:ascii="Arial Unicode MS" w:hAnsi="Arial Unicode MS" w:eastAsia="Arial Unicode MS"/>
+          <w:rFonts w:ascii="Hiragino Sans GB" w:hAnsi="Hiragino Sans GB" w:eastAsia="Hiragino Sans GB"/>
           <w:b w:val="0"/>
           <w:color w:val="182129"/>
           <w:sz w:val="21"/>
@@ -85,7 +85,7 @@
       </w:pPr>
       <w:r>
         <w:rPr>
-          <w:rFonts w:ascii="Arial Unicode MS" w:hAnsi="Arial Unicode MS" w:eastAsia="Arial Unicode MS"/>
+          <w:rFonts w:ascii="Hiragino Sans GB" w:hAnsi="Hiragino Sans GB" w:eastAsia="Hiragino Sans GB"/>
           <w:b/>
           <w:color w:val="1F4D78"/>
           <w:sz w:val="21"/>
@@ -94,7 +94,7 @@
       </w:r>
       <w:r>
         <w:rPr>
-          <w:rFonts w:ascii="Calibri" w:hAnsi="Calibri" w:eastAsia="Arial Unicode MS"/>
+          <w:rFonts w:ascii="Arial" w:hAnsi="Arial" w:eastAsia="Hiragino Sans GB"/>
           <w:color w:val="182129"/>
           <w:sz w:val="21"/>
         </w:rPr>
@@ -107,7 +107,7 @@
       </w:pPr>
       <w:r>
         <w:rPr>
-          <w:rFonts w:ascii="Arial Unicode MS" w:hAnsi="Arial Unicode MS" w:eastAsia="Arial Unicode MS"/>
+          <w:rFonts w:ascii="Hiragino Sans GB" w:hAnsi="Hiragino Sans GB" w:eastAsia="Hiragino Sans GB"/>
           <w:b/>
           <w:color w:val="1F4D78"/>
           <w:sz w:val="21"/>
@@ -116,7 +116,7 @@
       </w:r>
       <w:r>
         <w:rPr>
-          <w:rFonts w:ascii="Calibri" w:hAnsi="Calibri" w:eastAsia="Arial Unicode MS"/>
+          <w:rFonts w:ascii="Arial" w:hAnsi="Arial" w:eastAsia="Hiragino Sans GB"/>
           <w:color w:val="182129"/>
           <w:sz w:val="21"/>
         </w:rPr>
@@ -129,7 +129,7 @@
       </w:pPr>
       <w:r>
         <w:rPr>
-          <w:rFonts w:ascii="Arial Unicode MS" w:hAnsi="Arial Unicode MS" w:eastAsia="Arial Unicode MS"/>
+          <w:rFonts w:ascii="Hiragino Sans GB" w:hAnsi="Hiragino Sans GB" w:eastAsia="Hiragino Sans GB"/>
           <w:b/>
           <w:color w:val="1F4D78"/>
           <w:sz w:val="21"/>
@@ -138,7 +138,7 @@
       </w:r>
       <w:r>
         <w:rPr>
-          <w:rFonts w:ascii="Arial Unicode MS" w:hAnsi="Arial Unicode MS" w:eastAsia="Arial Unicode MS"/>
+          <w:rFonts w:ascii="Hiragino Sans GB" w:hAnsi="Hiragino Sans GB" w:eastAsia="Hiragino Sans GB"/>
           <w:color w:val="182129"/>
           <w:sz w:val="21"/>
         </w:rPr>
@@ -151,7 +151,7 @@
       </w:pPr>
       <w:r>
         <w:rPr>
-          <w:rFonts w:ascii="Arial Unicode MS" w:hAnsi="Arial Unicode MS" w:eastAsia="Arial Unicode MS"/>
+          <w:rFonts w:ascii="Hiragino Sans GB" w:hAnsi="Hiragino Sans GB" w:eastAsia="Hiragino Sans GB"/>
           <w:b/>
           <w:color w:val="1F4D78"/>
           <w:sz w:val="21"/>
@@ -160,7 +160,7 @@
       </w:r>
       <w:r>
         <w:rPr>
-          <w:rFonts w:ascii="Arial Unicode MS" w:hAnsi="Arial Unicode MS" w:eastAsia="Arial Unicode MS"/>
+          <w:rFonts w:ascii="Hiragino Sans GB" w:hAnsi="Hiragino Sans GB" w:eastAsia="Hiragino Sans GB"/>
           <w:color w:val="182129"/>
           <w:sz w:val="21"/>
         </w:rPr>
@@ -173,7 +173,7 @@
       </w:pPr>
       <w:r>
         <w:rPr>
-          <w:rFonts w:ascii="Arial Unicode MS" w:hAnsi="Arial Unicode MS" w:eastAsia="Arial Unicode MS"/>
+          <w:rFonts w:ascii="Hiragino Sans GB" w:hAnsi="Hiragino Sans GB" w:eastAsia="Hiragino Sans GB"/>
           <w:b/>
           <w:color w:val="1F4D78"/>
           <w:sz w:val="21"/>
@@ -182,7 +182,7 @@
       </w:r>
       <w:r>
         <w:rPr>
-          <w:rFonts w:ascii="Arial Unicode MS" w:hAnsi="Arial Unicode MS" w:eastAsia="Arial Unicode MS"/>
+          <w:rFonts w:ascii="Hiragino Sans GB" w:hAnsi="Hiragino Sans GB" w:eastAsia="Hiragino Sans GB"/>
           <w:color w:val="182129"/>
           <w:sz w:val="21"/>
         </w:rPr>
@@ -197,7 +197,7 @@
       </w:pPr>
       <w:r>
         <w:rPr>
-          <w:rFonts w:ascii="Arial Unicode MS" w:hAnsi="Arial Unicode MS" w:eastAsia="Arial Unicode MS"/>
+          <w:rFonts w:ascii="Hiragino Sans GB" w:hAnsi="Hiragino Sans GB" w:eastAsia="Hiragino Sans GB"/>
           <w:b/>
           <w:color w:val="62246D"/>
           <w:sz w:val="18"/>
@@ -207,7 +207,7 @@
       </w:r>
       <w:r>
         <w:rPr>
-          <w:rFonts w:ascii="Arial Unicode MS" w:hAnsi="Arial Unicode MS" w:eastAsia="Arial Unicode MS"/>
+          <w:rFonts w:ascii="Hiragino Sans GB" w:hAnsi="Hiragino Sans GB" w:eastAsia="Hiragino Sans GB"/>
           <w:b/>
           <w:color w:val="182129"/>
           <w:sz w:val="21"/>
@@ -236,7 +236,7 @@
       </w:pPr>
       <w:r>
         <w:rPr>
-          <w:rFonts w:ascii="Arial Unicode MS" w:hAnsi="Arial Unicode MS" w:eastAsia="Arial Unicode MS"/>
+          <w:rFonts w:ascii="Hiragino Sans GB" w:hAnsi="Hiragino Sans GB" w:eastAsia="Hiragino Sans GB"/>
           <w:b w:val="0"/>
           <w:i w:val="0"/>
           <w:color w:val="182129"/>
@@ -283,7 +283,7 @@
             </w:pPr>
             <w:r>
               <w:rPr>
-                <w:rFonts w:ascii="Calibri" w:hAnsi="Calibri" w:eastAsia="Arial Unicode MS"/>
+                <w:rFonts w:ascii="Arial" w:hAnsi="Arial" w:eastAsia="Hiragino Sans GB"/>
                 <w:b/>
                 <w:color w:val="1F4D78"/>
                 <w:sz w:val="18"/>
@@ -311,7 +311,7 @@
             </w:pPr>
             <w:r>
               <w:rPr>
-                <w:rFonts w:ascii="Arial Unicode MS" w:hAnsi="Arial Unicode MS" w:eastAsia="Arial Unicode MS"/>
+                <w:rFonts w:ascii="Hiragino Sans GB" w:hAnsi="Hiragino Sans GB" w:eastAsia="Hiragino Sans GB"/>
                 <w:b/>
                 <w:color w:val="1F4D78"/>
                 <w:sz w:val="18"/>
@@ -339,7 +339,7 @@
             </w:pPr>
             <w:r>
               <w:rPr>
-                <w:rFonts w:ascii="Arial Unicode MS" w:hAnsi="Arial Unicode MS" w:eastAsia="Arial Unicode MS"/>
+                <w:rFonts w:ascii="Hiragino Sans GB" w:hAnsi="Hiragino Sans GB" w:eastAsia="Hiragino Sans GB"/>
                 <w:b/>
                 <w:color w:val="1F4D78"/>
                 <w:sz w:val="18"/>
@@ -367,7 +367,7 @@
             </w:pPr>
             <w:r>
               <w:rPr>
-                <w:rFonts w:ascii="Arial Unicode MS" w:hAnsi="Arial Unicode MS" w:eastAsia="Arial Unicode MS"/>
+                <w:rFonts w:ascii="Hiragino Sans GB" w:hAnsi="Hiragino Sans GB" w:eastAsia="Hiragino Sans GB"/>
                 <w:b/>
                 <w:color w:val="1F4D78"/>
                 <w:sz w:val="18"/>
@@ -396,7 +396,7 @@
             </w:pPr>
             <w:r>
               <w:rPr>
-                <w:rFonts w:ascii="Arial Unicode MS" w:hAnsi="Arial Unicode MS" w:eastAsia="Arial Unicode MS"/>
+                <w:rFonts w:ascii="Hiragino Sans GB" w:hAnsi="Hiragino Sans GB" w:eastAsia="Hiragino Sans GB"/>
                 <w:color w:val="182129"/>
                 <w:sz w:val="17"/>
               </w:rPr>
@@ -422,7 +422,7 @@
             </w:pPr>
             <w:r>
               <w:rPr>
-                <w:rFonts w:ascii="Calibri" w:hAnsi="Calibri" w:eastAsia="Arial Unicode MS"/>
+                <w:rFonts w:ascii="Arial" w:hAnsi="Arial" w:eastAsia="Hiragino Sans GB"/>
                 <w:color w:val="182129"/>
                 <w:sz w:val="17"/>
               </w:rPr>
@@ -448,7 +448,7 @@
             </w:pPr>
             <w:r>
               <w:rPr>
-                <w:rFonts w:ascii="Arial Unicode MS" w:hAnsi="Arial Unicode MS" w:eastAsia="Arial Unicode MS"/>
+                <w:rFonts w:ascii="Hiragino Sans GB" w:hAnsi="Hiragino Sans GB" w:eastAsia="Hiragino Sans GB"/>
                 <w:color w:val="182129"/>
                 <w:sz w:val="17"/>
               </w:rPr>
@@ -473,7 +473,7 @@
             </w:pPr>
             <w:r>
               <w:rPr>
-                <w:rFonts w:ascii="Arial Unicode MS" w:hAnsi="Arial Unicode MS" w:eastAsia="Arial Unicode MS"/>
+                <w:rFonts w:ascii="Hiragino Sans GB" w:hAnsi="Hiragino Sans GB" w:eastAsia="Hiragino Sans GB"/>
                 <w:color w:val="182129"/>
                 <w:sz w:val="17"/>
               </w:rPr>
@@ -501,7 +501,7 @@
             </w:pPr>
             <w:r>
               <w:rPr>
-                <w:rFonts w:ascii="Arial Unicode MS" w:hAnsi="Arial Unicode MS" w:eastAsia="Arial Unicode MS"/>
+                <w:rFonts w:ascii="Hiragino Sans GB" w:hAnsi="Hiragino Sans GB" w:eastAsia="Hiragino Sans GB"/>
                 <w:color w:val="182129"/>
                 <w:sz w:val="17"/>
               </w:rPr>
@@ -527,7 +527,7 @@
             </w:pPr>
             <w:r>
               <w:rPr>
-                <w:rFonts w:ascii="Calibri" w:hAnsi="Calibri" w:eastAsia="Arial Unicode MS"/>
+                <w:rFonts w:ascii="Arial" w:hAnsi="Arial" w:eastAsia="Hiragino Sans GB"/>
                 <w:color w:val="182129"/>
                 <w:sz w:val="17"/>
               </w:rPr>
@@ -553,7 +553,7 @@
             </w:pPr>
             <w:r>
               <w:rPr>
-                <w:rFonts w:ascii="Arial Unicode MS" w:hAnsi="Arial Unicode MS" w:eastAsia="Arial Unicode MS"/>
+                <w:rFonts w:ascii="Hiragino Sans GB" w:hAnsi="Hiragino Sans GB" w:eastAsia="Hiragino Sans GB"/>
                 <w:color w:val="182129"/>
                 <w:sz w:val="17"/>
               </w:rPr>
@@ -578,7 +578,7 @@
             </w:pPr>
             <w:r>
               <w:rPr>
-                <w:rFonts w:ascii="Arial Unicode MS" w:hAnsi="Arial Unicode MS" w:eastAsia="Arial Unicode MS"/>
+                <w:rFonts w:ascii="Hiragino Sans GB" w:hAnsi="Hiragino Sans GB" w:eastAsia="Hiragino Sans GB"/>
                 <w:color w:val="182129"/>
                 <w:sz w:val="17"/>
               </w:rPr>
@@ -606,7 +606,7 @@
             </w:pPr>
             <w:r>
               <w:rPr>
-                <w:rFonts w:ascii="Arial Unicode MS" w:hAnsi="Arial Unicode MS" w:eastAsia="Arial Unicode MS"/>
+                <w:rFonts w:ascii="Hiragino Sans GB" w:hAnsi="Hiragino Sans GB" w:eastAsia="Hiragino Sans GB"/>
                 <w:color w:val="182129"/>
                 <w:sz w:val="17"/>
               </w:rPr>
@@ -632,7 +632,7 @@
             </w:pPr>
             <w:r>
               <w:rPr>
-                <w:rFonts w:ascii="Calibri" w:hAnsi="Calibri" w:eastAsia="Arial Unicode MS"/>
+                <w:rFonts w:ascii="Arial" w:hAnsi="Arial" w:eastAsia="Hiragino Sans GB"/>
                 <w:color w:val="182129"/>
                 <w:sz w:val="17"/>
               </w:rPr>
@@ -658,7 +658,7 @@
             </w:pPr>
             <w:r>
               <w:rPr>
-                <w:rFonts w:ascii="Arial Unicode MS" w:hAnsi="Arial Unicode MS" w:eastAsia="Arial Unicode MS"/>
+                <w:rFonts w:ascii="Hiragino Sans GB" w:hAnsi="Hiragino Sans GB" w:eastAsia="Hiragino Sans GB"/>
                 <w:color w:val="182129"/>
                 <w:sz w:val="17"/>
               </w:rPr>
@@ -683,7 +683,7 @@
             </w:pPr>
             <w:r>
               <w:rPr>
-                <w:rFonts w:ascii="Arial Unicode MS" w:hAnsi="Arial Unicode MS" w:eastAsia="Arial Unicode MS"/>
+                <w:rFonts w:ascii="Hiragino Sans GB" w:hAnsi="Hiragino Sans GB" w:eastAsia="Hiragino Sans GB"/>
                 <w:color w:val="182129"/>
                 <w:sz w:val="17"/>
               </w:rPr>
@@ -711,7 +711,7 @@
             </w:pPr>
             <w:r>
               <w:rPr>
-                <w:rFonts w:ascii="Arial Unicode MS" w:hAnsi="Arial Unicode MS" w:eastAsia="Arial Unicode MS"/>
+                <w:rFonts w:ascii="Hiragino Sans GB" w:hAnsi="Hiragino Sans GB" w:eastAsia="Hiragino Sans GB"/>
                 <w:color w:val="182129"/>
                 <w:sz w:val="17"/>
               </w:rPr>
@@ -737,7 +737,7 @@
             </w:pPr>
             <w:r>
               <w:rPr>
-                <w:rFonts w:ascii="Calibri" w:hAnsi="Calibri" w:eastAsia="Arial Unicode MS"/>
+                <w:rFonts w:ascii="Arial" w:hAnsi="Arial" w:eastAsia="Hiragino Sans GB"/>
                 <w:color w:val="182129"/>
                 <w:sz w:val="17"/>
               </w:rPr>
@@ -763,7 +763,7 @@
             </w:pPr>
             <w:r>
               <w:rPr>
-                <w:rFonts w:ascii="Arial Unicode MS" w:hAnsi="Arial Unicode MS" w:eastAsia="Arial Unicode MS"/>
+                <w:rFonts w:ascii="Hiragino Sans GB" w:hAnsi="Hiragino Sans GB" w:eastAsia="Hiragino Sans GB"/>
                 <w:color w:val="182129"/>
                 <w:sz w:val="17"/>
               </w:rPr>
@@ -788,7 +788,7 @@
             </w:pPr>
             <w:r>
               <w:rPr>
-                <w:rFonts w:ascii="Arial Unicode MS" w:hAnsi="Arial Unicode MS" w:eastAsia="Arial Unicode MS"/>
+                <w:rFonts w:ascii="Hiragino Sans GB" w:hAnsi="Hiragino Sans GB" w:eastAsia="Hiragino Sans GB"/>
                 <w:color w:val="182129"/>
                 <w:sz w:val="17"/>
               </w:rPr>
@@ -811,7 +811,7 @@
       </w:pPr>
       <w:r>
         <w:rPr>
-          <w:rFonts w:ascii="Arial Unicode MS" w:hAnsi="Arial Unicode MS" w:eastAsia="Arial Unicode MS"/>
+          <w:rFonts w:ascii="Hiragino Sans GB" w:hAnsi="Hiragino Sans GB" w:eastAsia="Hiragino Sans GB"/>
           <w:b/>
           <w:color w:val="1F4D78"/>
           <w:sz w:val="18"/>
@@ -821,12 +821,12 @@
       </w:r>
       <w:r>
         <w:rPr>
-          <w:rFonts w:ascii="Arial Unicode MS" w:hAnsi="Arial Unicode MS" w:eastAsia="Arial Unicode MS"/>
+          <w:rFonts w:ascii="Hiragino Sans GB" w:hAnsi="Hiragino Sans GB" w:eastAsia="Hiragino Sans GB"/>
           <w:b w:val="0"/>
           <w:color w:val="182129"/>
           <w:sz w:val="21"/>
         </w:rPr>
-        <w:t>全文约945个汉字。以每分钟约190个汉字的清晰学术语速，加上指图和视频停顿，约为5分钟。</w:t>
+        <w:t>英文正式稿共659词。以每分钟约132词的清晰学术语速，加上指图和约5秒视频停顿，约为5分钟。</w:t>
       </w:r>
     </w:p>
     <w:p>
@@ -844,7 +844,7 @@
       </w:pPr>
       <w:r>
         <w:rPr>
-          <w:rFonts w:ascii="Arial Unicode MS" w:hAnsi="Arial Unicode MS" w:eastAsia="Arial Unicode MS"/>
+          <w:rFonts w:ascii="Hiragino Sans GB" w:hAnsi="Hiragino Sans GB" w:eastAsia="Hiragino Sans GB"/>
           <w:color w:val="182129"/>
           <w:sz w:val="21"/>
         </w:rPr>
@@ -858,7 +858,7 @@
       </w:pPr>
       <w:r>
         <w:rPr>
-          <w:rFonts w:ascii="Arial Unicode MS" w:hAnsi="Arial Unicode MS" w:eastAsia="Arial Unicode MS"/>
+          <w:rFonts w:ascii="Hiragino Sans GB" w:hAnsi="Hiragino Sans GB" w:eastAsia="Hiragino Sans GB"/>
           <w:color w:val="182129"/>
           <w:sz w:val="21"/>
         </w:rPr>
@@ -872,7 +872,7 @@
       </w:pPr>
       <w:r>
         <w:rPr>
-          <w:rFonts w:ascii="Arial Unicode MS" w:hAnsi="Arial Unicode MS" w:eastAsia="Arial Unicode MS"/>
+          <w:rFonts w:ascii="Hiragino Sans GB" w:hAnsi="Hiragino Sans GB" w:eastAsia="Hiragino Sans GB"/>
           <w:color w:val="182129"/>
           <w:sz w:val="21"/>
         </w:rPr>
@@ -886,7 +886,7 @@
       </w:pPr>
       <w:r>
         <w:rPr>
-          <w:rFonts w:ascii="Arial Unicode MS" w:hAnsi="Arial Unicode MS" w:eastAsia="Arial Unicode MS"/>
+          <w:rFonts w:ascii="Hiragino Sans GB" w:hAnsi="Hiragino Sans GB" w:eastAsia="Hiragino Sans GB"/>
           <w:color w:val="182129"/>
           <w:sz w:val="21"/>
         </w:rPr>
@@ -903,7 +903,7 @@
         <w:pStyle w:val="Heading1"/>
       </w:pPr>
       <w:r>
-        <w:t>Part I · 五分钟逐页演讲稿</w:t>
+        <w:t>Part I · 五分钟逐页演讲稿（English）</w:t>
       </w:r>
     </w:p>
     <w:p>
@@ -914,7 +914,7 @@
       </w:pPr>
       <w:r>
         <w:rPr>
-          <w:rFonts w:ascii="Arial Unicode MS" w:hAnsi="Arial Unicode MS" w:eastAsia="Arial Unicode MS"/>
+          <w:rFonts w:ascii="Hiragino Sans GB" w:hAnsi="Hiragino Sans GB" w:eastAsia="Hiragino Sans GB"/>
           <w:b w:val="0"/>
           <w:i/>
           <w:color w:val="57626E"/>
@@ -979,7 +979,7 @@
       </w:pPr>
       <w:r>
         <w:rPr>
-          <w:rFonts w:ascii="Arial Unicode MS" w:hAnsi="Arial Unicode MS" w:eastAsia="Arial Unicode MS"/>
+          <w:rFonts w:ascii="Hiragino Sans GB" w:hAnsi="Hiragino Sans GB" w:eastAsia="Hiragino Sans GB"/>
           <w:b/>
           <w:color w:val="1F4D78"/>
           <w:sz w:val="18"/>
@@ -989,7 +989,7 @@
       </w:r>
       <w:r>
         <w:rPr>
-          <w:rFonts w:ascii="Arial Unicode MS" w:hAnsi="Arial Unicode MS" w:eastAsia="Arial Unicode MS"/>
+          <w:rFonts w:ascii="Hiragino Sans GB" w:hAnsi="Hiragino Sans GB" w:eastAsia="Hiragino Sans GB"/>
           <w:b w:val="0"/>
           <w:color w:val="182129"/>
           <w:sz w:val="21"/>
@@ -1005,7 +1005,7 @@
       </w:pPr>
       <w:r>
         <w:rPr>
-          <w:rFonts w:ascii="Calibri" w:hAnsi="Calibri" w:eastAsia="Arial Unicode MS"/>
+          <w:rFonts w:ascii="Arial" w:hAnsi="Arial" w:eastAsia="Hiragino Sans GB"/>
           <w:b w:val="0"/>
           <w:i w:val="0"/>
           <w:color w:val="182129"/>
@@ -1022,7 +1022,7 @@
       </w:pPr>
       <w:r>
         <w:rPr>
-          <w:rFonts w:ascii="Arial Unicode MS" w:hAnsi="Arial Unicode MS" w:eastAsia="Arial Unicode MS"/>
+          <w:rFonts w:ascii="Hiragino Sans GB" w:hAnsi="Hiragino Sans GB" w:eastAsia="Hiragino Sans GB"/>
           <w:b/>
           <w:color w:val="007F82"/>
           <w:sz w:val="18"/>
@@ -1032,7 +1032,7 @@
       </w:r>
       <w:r>
         <w:rPr>
-          <w:rFonts w:ascii="Arial Unicode MS" w:hAnsi="Arial Unicode MS" w:eastAsia="Arial Unicode MS"/>
+          <w:rFonts w:ascii="Hiragino Sans GB" w:hAnsi="Hiragino Sans GB" w:eastAsia="Hiragino Sans GB"/>
           <w:b/>
           <w:color w:val="182129"/>
           <w:sz w:val="21"/>
@@ -1041,13 +1041,9 @@
       </w:r>
     </w:p>
     <w:p>
-      <w:r>
-        <w:br w:type="page"/>
-      </w:r>
-    </w:p>
-    <w:p>
       <w:pPr>
         <w:pStyle w:val="Heading2"/>
+        <w:pageBreakBefore/>
       </w:pPr>
       <w:r>
         <w:t>第2页 · 空间热点与时空共同变化  |  1:10–2:15</w:t>
@@ -1101,7 +1097,7 @@
       </w:pPr>
       <w:r>
         <w:rPr>
-          <w:rFonts w:ascii="Arial Unicode MS" w:hAnsi="Arial Unicode MS" w:eastAsia="Arial Unicode MS"/>
+          <w:rFonts w:ascii="Hiragino Sans GB" w:hAnsi="Hiragino Sans GB" w:eastAsia="Hiragino Sans GB"/>
           <w:b/>
           <w:color w:val="1F4D78"/>
           <w:sz w:val="18"/>
@@ -1111,7 +1107,7 @@
       </w:r>
       <w:r>
         <w:rPr>
-          <w:rFonts w:ascii="Arial Unicode MS" w:hAnsi="Arial Unicode MS" w:eastAsia="Arial Unicode MS"/>
+          <w:rFonts w:ascii="Hiragino Sans GB" w:hAnsi="Hiragino Sans GB" w:eastAsia="Hiragino Sans GB"/>
           <w:b w:val="0"/>
           <w:color w:val="182129"/>
           <w:sz w:val="21"/>
@@ -1127,7 +1123,7 @@
       </w:pPr>
       <w:r>
         <w:rPr>
-          <w:rFonts w:ascii="Calibri" w:hAnsi="Calibri" w:eastAsia="Arial Unicode MS"/>
+          <w:rFonts w:ascii="Arial" w:hAnsi="Arial" w:eastAsia="Hiragino Sans GB"/>
           <w:b w:val="0"/>
           <w:i w:val="0"/>
           <w:color w:val="182129"/>
@@ -1144,7 +1140,7 @@
       </w:pPr>
       <w:r>
         <w:rPr>
-          <w:rFonts w:ascii="Arial Unicode MS" w:hAnsi="Arial Unicode MS" w:eastAsia="Arial Unicode MS"/>
+          <w:rFonts w:ascii="Hiragino Sans GB" w:hAnsi="Hiragino Sans GB" w:eastAsia="Hiragino Sans GB"/>
           <w:b/>
           <w:color w:val="007F82"/>
           <w:sz w:val="18"/>
@@ -1154,7 +1150,7 @@
       </w:r>
       <w:r>
         <w:rPr>
-          <w:rFonts w:ascii="Arial Unicode MS" w:hAnsi="Arial Unicode MS" w:eastAsia="Arial Unicode MS"/>
+          <w:rFonts w:ascii="Hiragino Sans GB" w:hAnsi="Hiragino Sans GB" w:eastAsia="Hiragino Sans GB"/>
           <w:b/>
           <w:color w:val="182129"/>
           <w:sz w:val="21"/>
@@ -1163,13 +1159,9 @@
       </w:r>
     </w:p>
     <w:p>
-      <w:r>
-        <w:br w:type="page"/>
-      </w:r>
-    </w:p>
-    <w:p>
       <w:pPr>
         <w:pStyle w:val="Heading2"/>
+        <w:pageBreakBefore/>
       </w:pPr>
       <w:r>
         <w:t>第3页 · Task 4：基函数线性回归  |  2:15–4:05</w:t>
@@ -1223,7 +1215,7 @@
       </w:pPr>
       <w:r>
         <w:rPr>
-          <w:rFonts w:ascii="Arial Unicode MS" w:hAnsi="Arial Unicode MS" w:eastAsia="Arial Unicode MS"/>
+          <w:rFonts w:ascii="Hiragino Sans GB" w:hAnsi="Hiragino Sans GB" w:eastAsia="Hiragino Sans GB"/>
           <w:b/>
           <w:color w:val="1F4D78"/>
           <w:sz w:val="18"/>
@@ -1233,7 +1225,7 @@
       </w:r>
       <w:r>
         <w:rPr>
-          <w:rFonts w:ascii="Arial Unicode MS" w:hAnsi="Arial Unicode MS" w:eastAsia="Arial Unicode MS"/>
+          <w:rFonts w:ascii="Hiragino Sans GB" w:hAnsi="Hiragino Sans GB" w:eastAsia="Hiragino Sans GB"/>
           <w:b w:val="0"/>
           <w:color w:val="182129"/>
           <w:sz w:val="21"/>
@@ -1249,7 +1241,7 @@
       </w:pPr>
       <w:r>
         <w:rPr>
-          <w:rFonts w:ascii="Calibri" w:hAnsi="Calibri" w:eastAsia="Arial Unicode MS"/>
+          <w:rFonts w:ascii="Arial" w:hAnsi="Arial" w:eastAsia="Hiragino Sans GB"/>
           <w:b w:val="0"/>
           <w:i w:val="0"/>
           <w:color w:val="182129"/>
@@ -1266,7 +1258,7 @@
       </w:pPr>
       <w:r>
         <w:rPr>
-          <w:rFonts w:ascii="Arial Unicode MS" w:hAnsi="Arial Unicode MS" w:eastAsia="Arial Unicode MS"/>
+          <w:rFonts w:ascii="Hiragino Sans GB" w:hAnsi="Hiragino Sans GB" w:eastAsia="Hiragino Sans GB"/>
           <w:b/>
           <w:color w:val="007F82"/>
           <w:sz w:val="18"/>
@@ -1276,7 +1268,7 @@
       </w:r>
       <w:r>
         <w:rPr>
-          <w:rFonts w:ascii="Arial Unicode MS" w:hAnsi="Arial Unicode MS" w:eastAsia="Arial Unicode MS"/>
+          <w:rFonts w:ascii="Hiragino Sans GB" w:hAnsi="Hiragino Sans GB" w:eastAsia="Hiragino Sans GB"/>
           <w:b/>
           <w:color w:val="182129"/>
           <w:sz w:val="21"/>
@@ -1285,13 +1277,9 @@
       </w:r>
     </w:p>
     <w:p>
-      <w:r>
-        <w:br w:type="page"/>
-      </w:r>
-    </w:p>
-    <w:p>
       <w:pPr>
         <w:pStyle w:val="Heading2"/>
+        <w:pageBreakBefore/>
       </w:pPr>
       <w:r>
         <w:t>第4页 · 预测、残差与结论  |  4:05–5:00</w:t>
@@ -1345,7 +1333,7 @@
       </w:pPr>
       <w:r>
         <w:rPr>
-          <w:rFonts w:ascii="Arial Unicode MS" w:hAnsi="Arial Unicode MS" w:eastAsia="Arial Unicode MS"/>
+          <w:rFonts w:ascii="Hiragino Sans GB" w:hAnsi="Hiragino Sans GB" w:eastAsia="Hiragino Sans GB"/>
           <w:b/>
           <w:color w:val="1F4D78"/>
           <w:sz w:val="18"/>
@@ -1355,7 +1343,7 @@
       </w:r>
       <w:r>
         <w:rPr>
-          <w:rFonts w:ascii="Arial Unicode MS" w:hAnsi="Arial Unicode MS" w:eastAsia="Arial Unicode MS"/>
+          <w:rFonts w:ascii="Hiragino Sans GB" w:hAnsi="Hiragino Sans GB" w:eastAsia="Hiragino Sans GB"/>
           <w:b w:val="0"/>
           <w:color w:val="182129"/>
           <w:sz w:val="21"/>
@@ -1371,7 +1359,7 @@
       </w:pPr>
       <w:r>
         <w:rPr>
-          <w:rFonts w:ascii="Calibri" w:hAnsi="Calibri" w:eastAsia="Arial Unicode MS"/>
+          <w:rFonts w:ascii="Arial" w:hAnsi="Arial" w:eastAsia="Hiragino Sans GB"/>
           <w:b w:val="0"/>
           <w:i w:val="0"/>
           <w:color w:val="182129"/>
@@ -1388,7 +1376,7 @@
       </w:pPr>
       <w:r>
         <w:rPr>
-          <w:rFonts w:ascii="Arial Unicode MS" w:hAnsi="Arial Unicode MS" w:eastAsia="Arial Unicode MS"/>
+          <w:rFonts w:ascii="Hiragino Sans GB" w:hAnsi="Hiragino Sans GB" w:eastAsia="Hiragino Sans GB"/>
           <w:b/>
           <w:color w:val="007F82"/>
           <w:sz w:val="18"/>
@@ -1398,7 +1386,7 @@
       </w:r>
       <w:r>
         <w:rPr>
-          <w:rFonts w:ascii="Arial Unicode MS" w:hAnsi="Arial Unicode MS" w:eastAsia="Arial Unicode MS"/>
+          <w:rFonts w:ascii="Hiragino Sans GB" w:hAnsi="Hiragino Sans GB" w:eastAsia="Hiragino Sans GB"/>
           <w:b/>
           <w:color w:val="182129"/>
           <w:sz w:val="21"/>
@@ -1407,13 +1395,9 @@
       </w:r>
     </w:p>
     <w:p>
-      <w:r>
-        <w:br w:type="page"/>
-      </w:r>
-    </w:p>
-    <w:p>
       <w:pPr>
         <w:pStyle w:val="Heading1"/>
+        <w:pageBreakBefore/>
       </w:pPr>
       <w:r>
         <w:t>Part II · 方法原理解析</w:t>
@@ -1427,7 +1411,7 @@
       </w:pPr>
       <w:r>
         <w:rPr>
-          <w:rFonts w:ascii="Arial Unicode MS" w:hAnsi="Arial Unicode MS" w:eastAsia="Arial Unicode MS"/>
+          <w:rFonts w:ascii="Hiragino Sans GB" w:hAnsi="Hiragino Sans GB" w:eastAsia="Hiragino Sans GB"/>
           <w:b w:val="0"/>
           <w:i w:val="0"/>
           <w:color w:val="182129"/>
@@ -1450,7 +1434,7 @@
       </w:pPr>
       <w:r>
         <w:rPr>
-          <w:rFonts w:ascii="Arial Unicode MS" w:hAnsi="Arial Unicode MS" w:eastAsia="Arial Unicode MS"/>
+          <w:rFonts w:ascii="Hiragino Sans GB" w:hAnsi="Hiragino Sans GB" w:eastAsia="Hiragino Sans GB"/>
           <w:b/>
           <w:color w:val="1F4D78"/>
           <w:sz w:val="21"/>
@@ -1459,7 +1443,7 @@
       </w:r>
       <w:r>
         <w:rPr>
-          <w:rFonts w:ascii="Arial Unicode MS" w:hAnsi="Arial Unicode MS" w:eastAsia="Arial Unicode MS"/>
+          <w:rFonts w:ascii="Hiragino Sans GB" w:hAnsi="Hiragino Sans GB" w:eastAsia="Hiragino Sans GB"/>
           <w:color w:val="182129"/>
           <w:sz w:val="21"/>
         </w:rPr>
@@ -1474,7 +1458,7 @@
       </w:pPr>
       <w:r>
         <w:rPr>
-          <w:rFonts w:ascii="Arial Unicode MS" w:hAnsi="Arial Unicode MS" w:eastAsia="Arial Unicode MS"/>
+          <w:rFonts w:ascii="Hiragino Sans GB" w:hAnsi="Hiragino Sans GB" w:eastAsia="Hiragino Sans GB"/>
           <w:b/>
           <w:color w:val="62246D"/>
           <w:sz w:val="18"/>
@@ -1484,7 +1468,7 @@
       </w:r>
       <w:r>
         <w:rPr>
-          <w:rFonts w:ascii="Arial Unicode MS" w:hAnsi="Arial Unicode MS" w:eastAsia="Arial Unicode MS"/>
+          <w:rFonts w:ascii="Hiragino Sans GB" w:hAnsi="Hiragino Sans GB" w:eastAsia="Hiragino Sans GB"/>
           <w:b w:val="0"/>
           <w:color w:val="182129"/>
           <w:sz w:val="21"/>
@@ -1498,7 +1482,7 @@
       </w:pPr>
       <w:r>
         <w:rPr>
-          <w:rFonts w:ascii="Arial Unicode MS" w:hAnsi="Arial Unicode MS" w:eastAsia="Arial Unicode MS"/>
+          <w:rFonts w:ascii="Hiragino Sans GB" w:hAnsi="Hiragino Sans GB" w:eastAsia="Hiragino Sans GB"/>
           <w:b/>
           <w:color w:val="1F4D78"/>
           <w:sz w:val="21"/>
@@ -1507,7 +1491,7 @@
       </w:r>
       <w:r>
         <w:rPr>
-          <w:rFonts w:ascii="Arial Unicode MS" w:hAnsi="Arial Unicode MS" w:eastAsia="Arial Unicode MS"/>
+          <w:rFonts w:ascii="Hiragino Sans GB" w:hAnsi="Hiragino Sans GB" w:eastAsia="Hiragino Sans GB"/>
           <w:color w:val="182129"/>
           <w:sz w:val="21"/>
         </w:rPr>
@@ -1520,7 +1504,7 @@
       </w:pPr>
       <w:r>
         <w:rPr>
-          <w:rFonts w:ascii="Arial Unicode MS" w:hAnsi="Arial Unicode MS" w:eastAsia="Arial Unicode MS"/>
+          <w:rFonts w:ascii="Hiragino Sans GB" w:hAnsi="Hiragino Sans GB" w:eastAsia="Hiragino Sans GB"/>
           <w:b/>
           <w:color w:val="1F4D78"/>
           <w:sz w:val="21"/>
@@ -1529,7 +1513,7 @@
       </w:r>
       <w:r>
         <w:rPr>
-          <w:rFonts w:ascii="Arial Unicode MS" w:hAnsi="Arial Unicode MS" w:eastAsia="Arial Unicode MS"/>
+          <w:rFonts w:ascii="Hiragino Sans GB" w:hAnsi="Hiragino Sans GB" w:eastAsia="Hiragino Sans GB"/>
           <w:color w:val="182129"/>
           <w:sz w:val="21"/>
         </w:rPr>
@@ -1550,7 +1534,7 @@
       </w:pPr>
       <w:r>
         <w:rPr>
-          <w:rFonts w:ascii="Arial Unicode MS" w:hAnsi="Arial Unicode MS" w:eastAsia="Arial Unicode MS"/>
+          <w:rFonts w:ascii="Hiragino Sans GB" w:hAnsi="Hiragino Sans GB" w:eastAsia="Hiragino Sans GB"/>
           <w:b/>
           <w:color w:val="1F4D78"/>
           <w:sz w:val="21"/>
@@ -1559,7 +1543,7 @@
       </w:r>
       <w:r>
         <w:rPr>
-          <w:rFonts w:ascii="Arial Unicode MS" w:hAnsi="Arial Unicode MS" w:eastAsia="Arial Unicode MS"/>
+          <w:rFonts w:ascii="Hiragino Sans GB" w:hAnsi="Hiragino Sans GB" w:eastAsia="Hiragino Sans GB"/>
           <w:color w:val="182129"/>
           <w:sz w:val="21"/>
         </w:rPr>
@@ -1574,7 +1558,7 @@
       </w:pPr>
       <w:r>
         <w:rPr>
-          <w:rFonts w:ascii="Arial Unicode MS" w:hAnsi="Arial Unicode MS" w:eastAsia="Arial Unicode MS"/>
+          <w:rFonts w:ascii="Hiragino Sans GB" w:hAnsi="Hiragino Sans GB" w:eastAsia="Hiragino Sans GB"/>
           <w:b/>
           <w:color w:val="62246D"/>
           <w:sz w:val="18"/>
@@ -1584,7 +1568,7 @@
       </w:r>
       <w:r>
         <w:rPr>
-          <w:rFonts w:ascii="Arial Unicode MS" w:hAnsi="Arial Unicode MS" w:eastAsia="Arial Unicode MS"/>
+          <w:rFonts w:ascii="Hiragino Sans GB" w:hAnsi="Hiragino Sans GB" w:eastAsia="Hiragino Sans GB"/>
           <w:b w:val="0"/>
           <w:color w:val="182129"/>
           <w:sz w:val="21"/>
@@ -1598,7 +1582,7 @@
       </w:pPr>
       <w:r>
         <w:rPr>
-          <w:rFonts w:ascii="Arial Unicode MS" w:hAnsi="Arial Unicode MS" w:eastAsia="Arial Unicode MS"/>
+          <w:rFonts w:ascii="Hiragino Sans GB" w:hAnsi="Hiragino Sans GB" w:eastAsia="Hiragino Sans GB"/>
           <w:b/>
           <w:color w:val="1F4D78"/>
           <w:sz w:val="21"/>
@@ -1607,7 +1591,7 @@
       </w:r>
       <w:r>
         <w:rPr>
-          <w:rFonts w:ascii="Arial Unicode MS" w:hAnsi="Arial Unicode MS" w:eastAsia="Arial Unicode MS"/>
+          <w:rFonts w:ascii="Hiragino Sans GB" w:hAnsi="Hiragino Sans GB" w:eastAsia="Hiragino Sans GB"/>
           <w:color w:val="182129"/>
           <w:sz w:val="21"/>
         </w:rPr>
@@ -1620,7 +1604,7 @@
       </w:pPr>
       <w:r>
         <w:rPr>
-          <w:rFonts w:ascii="Arial Unicode MS" w:hAnsi="Arial Unicode MS" w:eastAsia="Arial Unicode MS"/>
+          <w:rFonts w:ascii="Hiragino Sans GB" w:hAnsi="Hiragino Sans GB" w:eastAsia="Hiragino Sans GB"/>
           <w:b/>
           <w:color w:val="1F4D78"/>
           <w:sz w:val="21"/>
@@ -1629,7 +1613,7 @@
       </w:r>
       <w:r>
         <w:rPr>
-          <w:rFonts w:ascii="Arial Unicode MS" w:hAnsi="Arial Unicode MS" w:eastAsia="Arial Unicode MS"/>
+          <w:rFonts w:ascii="Hiragino Sans GB" w:hAnsi="Hiragino Sans GB" w:eastAsia="Hiragino Sans GB"/>
           <w:color w:val="182129"/>
           <w:sz w:val="21"/>
         </w:rPr>
@@ -1650,7 +1634,7 @@
       </w:pPr>
       <w:r>
         <w:rPr>
-          <w:rFonts w:ascii="Arial Unicode MS" w:hAnsi="Arial Unicode MS" w:eastAsia="Arial Unicode MS"/>
+          <w:rFonts w:ascii="Hiragino Sans GB" w:hAnsi="Hiragino Sans GB" w:eastAsia="Hiragino Sans GB"/>
           <w:b/>
           <w:color w:val="1F4D78"/>
           <w:sz w:val="21"/>
@@ -1659,7 +1643,7 @@
       </w:r>
       <w:r>
         <w:rPr>
-          <w:rFonts w:ascii="Arial Unicode MS" w:hAnsi="Arial Unicode MS" w:eastAsia="Arial Unicode MS"/>
+          <w:rFonts w:ascii="Hiragino Sans GB" w:hAnsi="Hiragino Sans GB" w:eastAsia="Hiragino Sans GB"/>
           <w:color w:val="182129"/>
           <w:sz w:val="21"/>
         </w:rPr>
@@ -1674,7 +1658,7 @@
       </w:pPr>
       <w:r>
         <w:rPr>
-          <w:rFonts w:ascii="Arial Unicode MS" w:hAnsi="Arial Unicode MS" w:eastAsia="Arial Unicode MS"/>
+          <w:rFonts w:ascii="Hiragino Sans GB" w:hAnsi="Hiragino Sans GB" w:eastAsia="Hiragino Sans GB"/>
           <w:b/>
           <w:color w:val="62246D"/>
           <w:sz w:val="18"/>
@@ -1684,7 +1668,7 @@
       </w:r>
       <w:r>
         <w:rPr>
-          <w:rFonts w:ascii="Arial Unicode MS" w:hAnsi="Arial Unicode MS" w:eastAsia="Arial Unicode MS"/>
+          <w:rFonts w:ascii="Hiragino Sans GB" w:hAnsi="Hiragino Sans GB" w:eastAsia="Hiragino Sans GB"/>
           <w:b w:val="0"/>
           <w:color w:val="182129"/>
           <w:sz w:val="21"/>
@@ -1698,7 +1682,7 @@
       </w:pPr>
       <w:r>
         <w:rPr>
-          <w:rFonts w:ascii="Arial Unicode MS" w:hAnsi="Arial Unicode MS" w:eastAsia="Arial Unicode MS"/>
+          <w:rFonts w:ascii="Hiragino Sans GB" w:hAnsi="Hiragino Sans GB" w:eastAsia="Hiragino Sans GB"/>
           <w:b/>
           <w:color w:val="1F4D78"/>
           <w:sz w:val="21"/>
@@ -1707,7 +1691,7 @@
       </w:r>
       <w:r>
         <w:rPr>
-          <w:rFonts w:ascii="Arial Unicode MS" w:hAnsi="Arial Unicode MS" w:eastAsia="Arial Unicode MS"/>
+          <w:rFonts w:ascii="Hiragino Sans GB" w:hAnsi="Hiragino Sans GB" w:eastAsia="Hiragino Sans GB"/>
           <w:color w:val="182129"/>
           <w:sz w:val="21"/>
         </w:rPr>
@@ -1720,7 +1704,7 @@
       </w:pPr>
       <w:r>
         <w:rPr>
-          <w:rFonts w:ascii="Arial Unicode MS" w:hAnsi="Arial Unicode MS" w:eastAsia="Arial Unicode MS"/>
+          <w:rFonts w:ascii="Hiragino Sans GB" w:hAnsi="Hiragino Sans GB" w:eastAsia="Hiragino Sans GB"/>
           <w:b/>
           <w:color w:val="1F4D78"/>
           <w:sz w:val="21"/>
@@ -1729,7 +1713,7 @@
       </w:r>
       <w:r>
         <w:rPr>
-          <w:rFonts w:ascii="Arial Unicode MS" w:hAnsi="Arial Unicode MS" w:eastAsia="Arial Unicode MS"/>
+          <w:rFonts w:ascii="Hiragino Sans GB" w:hAnsi="Hiragino Sans GB" w:eastAsia="Hiragino Sans GB"/>
           <w:color w:val="182129"/>
           <w:sz w:val="21"/>
         </w:rPr>
@@ -1737,13 +1721,9 @@
       </w:r>
     </w:p>
     <w:p>
-      <w:r>
-        <w:br w:type="page"/>
-      </w:r>
-    </w:p>
-    <w:p>
       <w:pPr>
         <w:pStyle w:val="Heading2"/>
+        <w:pageBreakBefore/>
       </w:pPr>
       <w:r>
         <w:t>4. 设计矩阵如何连接高等代数</w:t>
@@ -1755,7 +1735,7 @@
       </w:pPr>
       <w:r>
         <w:rPr>
-          <w:rFonts w:ascii="Arial Unicode MS" w:hAnsi="Arial Unicode MS" w:eastAsia="Arial Unicode MS"/>
+          <w:rFonts w:ascii="Hiragino Sans GB" w:hAnsi="Hiragino Sans GB" w:eastAsia="Hiragino Sans GB"/>
           <w:b/>
           <w:color w:val="1F4D78"/>
           <w:sz w:val="21"/>
@@ -1764,7 +1744,7 @@
       </w:r>
       <w:r>
         <w:rPr>
-          <w:rFonts w:ascii="Arial Unicode MS" w:hAnsi="Arial Unicode MS" w:eastAsia="Arial Unicode MS"/>
+          <w:rFonts w:ascii="Hiragino Sans GB" w:hAnsi="Hiragino Sans GB" w:eastAsia="Hiragino Sans GB"/>
           <w:color w:val="182129"/>
           <w:sz w:val="21"/>
         </w:rPr>
@@ -1779,7 +1759,7 @@
       </w:pPr>
       <w:r>
         <w:rPr>
-          <w:rFonts w:ascii="Arial Unicode MS" w:hAnsi="Arial Unicode MS" w:eastAsia="Arial Unicode MS"/>
+          <w:rFonts w:ascii="Hiragino Sans GB" w:hAnsi="Hiragino Sans GB" w:eastAsia="Hiragino Sans GB"/>
           <w:b/>
           <w:color w:val="62246D"/>
           <w:sz w:val="18"/>
@@ -1789,7 +1769,7 @@
       </w:r>
       <w:r>
         <w:rPr>
-          <w:rFonts w:ascii="Arial Unicode MS" w:hAnsi="Arial Unicode MS" w:eastAsia="Arial Unicode MS"/>
+          <w:rFonts w:ascii="Hiragino Sans GB" w:hAnsi="Hiragino Sans GB" w:eastAsia="Hiragino Sans GB"/>
           <w:b w:val="0"/>
           <w:color w:val="182129"/>
           <w:sz w:val="21"/>
@@ -1803,7 +1783,7 @@
       </w:pPr>
       <w:r>
         <w:rPr>
-          <w:rFonts w:ascii="Arial Unicode MS" w:hAnsi="Arial Unicode MS" w:eastAsia="Arial Unicode MS"/>
+          <w:rFonts w:ascii="Hiragino Sans GB" w:hAnsi="Hiragino Sans GB" w:eastAsia="Hiragino Sans GB"/>
           <w:b/>
           <w:color w:val="1F4D78"/>
           <w:sz w:val="21"/>
@@ -1812,7 +1792,7 @@
       </w:r>
       <w:r>
         <w:rPr>
-          <w:rFonts w:ascii="Arial Unicode MS" w:hAnsi="Arial Unicode MS" w:eastAsia="Arial Unicode MS"/>
+          <w:rFonts w:ascii="Hiragino Sans GB" w:hAnsi="Hiragino Sans GB" w:eastAsia="Hiragino Sans GB"/>
           <w:color w:val="182129"/>
           <w:sz w:val="21"/>
         </w:rPr>
@@ -1825,7 +1805,7 @@
       </w:pPr>
       <w:r>
         <w:rPr>
-          <w:rFonts w:ascii="Arial Unicode MS" w:hAnsi="Arial Unicode MS" w:eastAsia="Arial Unicode MS"/>
+          <w:rFonts w:ascii="Hiragino Sans GB" w:hAnsi="Hiragino Sans GB" w:eastAsia="Hiragino Sans GB"/>
           <w:b/>
           <w:color w:val="1F4D78"/>
           <w:sz w:val="21"/>
@@ -1834,7 +1814,7 @@
       </w:r>
       <w:r>
         <w:rPr>
-          <w:rFonts w:ascii="Arial Unicode MS" w:hAnsi="Arial Unicode MS" w:eastAsia="Arial Unicode MS"/>
+          <w:rFonts w:ascii="Hiragino Sans GB" w:hAnsi="Hiragino Sans GB" w:eastAsia="Hiragino Sans GB"/>
           <w:color w:val="182129"/>
           <w:sz w:val="21"/>
         </w:rPr>
@@ -1855,7 +1835,7 @@
       </w:pPr>
       <w:r>
         <w:rPr>
-          <w:rFonts w:ascii="Arial Unicode MS" w:hAnsi="Arial Unicode MS" w:eastAsia="Arial Unicode MS"/>
+          <w:rFonts w:ascii="Hiragino Sans GB" w:hAnsi="Hiragino Sans GB" w:eastAsia="Hiragino Sans GB"/>
           <w:b/>
           <w:color w:val="1F4D78"/>
           <w:sz w:val="21"/>
@@ -1864,7 +1844,7 @@
       </w:r>
       <w:r>
         <w:rPr>
-          <w:rFonts w:ascii="Arial Unicode MS" w:hAnsi="Arial Unicode MS" w:eastAsia="Arial Unicode MS"/>
+          <w:rFonts w:ascii="Hiragino Sans GB" w:hAnsi="Hiragino Sans GB" w:eastAsia="Hiragino Sans GB"/>
           <w:color w:val="182129"/>
           <w:sz w:val="21"/>
         </w:rPr>
@@ -1879,7 +1859,7 @@
       </w:pPr>
       <w:r>
         <w:rPr>
-          <w:rFonts w:ascii="Arial Unicode MS" w:hAnsi="Arial Unicode MS" w:eastAsia="Arial Unicode MS"/>
+          <w:rFonts w:ascii="Hiragino Sans GB" w:hAnsi="Hiragino Sans GB" w:eastAsia="Hiragino Sans GB"/>
           <w:b/>
           <w:color w:val="62246D"/>
           <w:sz w:val="18"/>
@@ -1889,7 +1869,7 @@
       </w:r>
       <w:r>
         <w:rPr>
-          <w:rFonts w:ascii="Arial Unicode MS" w:hAnsi="Arial Unicode MS" w:eastAsia="Arial Unicode MS"/>
+          <w:rFonts w:ascii="Hiragino Sans GB" w:hAnsi="Hiragino Sans GB" w:eastAsia="Hiragino Sans GB"/>
           <w:b w:val="0"/>
           <w:color w:val="182129"/>
           <w:sz w:val="21"/>
@@ -1903,7 +1883,7 @@
       </w:pPr>
       <w:r>
         <w:rPr>
-          <w:rFonts w:ascii="Arial Unicode MS" w:hAnsi="Arial Unicode MS" w:eastAsia="Arial Unicode MS"/>
+          <w:rFonts w:ascii="Hiragino Sans GB" w:hAnsi="Hiragino Sans GB" w:eastAsia="Hiragino Sans GB"/>
           <w:b/>
           <w:color w:val="1F4D78"/>
           <w:sz w:val="21"/>
@@ -1912,7 +1892,7 @@
       </w:r>
       <w:r>
         <w:rPr>
-          <w:rFonts w:ascii="Arial Unicode MS" w:hAnsi="Arial Unicode MS" w:eastAsia="Arial Unicode MS"/>
+          <w:rFonts w:ascii="Hiragino Sans GB" w:hAnsi="Hiragino Sans GB" w:eastAsia="Hiragino Sans GB"/>
           <w:color w:val="182129"/>
           <w:sz w:val="21"/>
         </w:rPr>
@@ -1925,7 +1905,7 @@
       </w:pPr>
       <w:r>
         <w:rPr>
-          <w:rFonts w:ascii="Arial Unicode MS" w:hAnsi="Arial Unicode MS" w:eastAsia="Arial Unicode MS"/>
+          <w:rFonts w:ascii="Hiragino Sans GB" w:hAnsi="Hiragino Sans GB" w:eastAsia="Hiragino Sans GB"/>
           <w:b/>
           <w:color w:val="1F4D78"/>
           <w:sz w:val="21"/>
@@ -1934,7 +1914,7 @@
       </w:r>
       <w:r>
         <w:rPr>
-          <w:rFonts w:ascii="Arial Unicode MS" w:hAnsi="Arial Unicode MS" w:eastAsia="Arial Unicode MS"/>
+          <w:rFonts w:ascii="Hiragino Sans GB" w:hAnsi="Hiragino Sans GB" w:eastAsia="Hiragino Sans GB"/>
           <w:color w:val="182129"/>
           <w:sz w:val="21"/>
         </w:rPr>
@@ -1955,7 +1935,7 @@
       </w:pPr>
       <w:r>
         <w:rPr>
-          <w:rFonts w:ascii="Arial Unicode MS" w:hAnsi="Arial Unicode MS" w:eastAsia="Arial Unicode MS"/>
+          <w:rFonts w:ascii="Hiragino Sans GB" w:hAnsi="Hiragino Sans GB" w:eastAsia="Hiragino Sans GB"/>
           <w:b/>
           <w:color w:val="1F4D78"/>
           <w:sz w:val="21"/>
@@ -1964,7 +1944,7 @@
       </w:r>
       <w:r>
         <w:rPr>
-          <w:rFonts w:ascii="Arial Unicode MS" w:hAnsi="Arial Unicode MS" w:eastAsia="Arial Unicode MS"/>
+          <w:rFonts w:ascii="Hiragino Sans GB" w:hAnsi="Hiragino Sans GB" w:eastAsia="Hiragino Sans GB"/>
           <w:color w:val="182129"/>
           <w:sz w:val="21"/>
         </w:rPr>
@@ -1979,7 +1959,7 @@
       </w:pPr>
       <w:r>
         <w:rPr>
-          <w:rFonts w:ascii="Arial Unicode MS" w:hAnsi="Arial Unicode MS" w:eastAsia="Arial Unicode MS"/>
+          <w:rFonts w:ascii="Hiragino Sans GB" w:hAnsi="Hiragino Sans GB" w:eastAsia="Hiragino Sans GB"/>
           <w:b/>
           <w:color w:val="62246D"/>
           <w:sz w:val="18"/>
@@ -1989,7 +1969,7 @@
       </w:r>
       <w:r>
         <w:rPr>
-          <w:rFonts w:ascii="Arial Unicode MS" w:hAnsi="Arial Unicode MS" w:eastAsia="Arial Unicode MS"/>
+          <w:rFonts w:ascii="Hiragino Sans GB" w:hAnsi="Hiragino Sans GB" w:eastAsia="Hiragino Sans GB"/>
           <w:b w:val="0"/>
           <w:color w:val="182129"/>
           <w:sz w:val="21"/>
@@ -2003,7 +1983,7 @@
       </w:pPr>
       <w:r>
         <w:rPr>
-          <w:rFonts w:ascii="Arial Unicode MS" w:hAnsi="Arial Unicode MS" w:eastAsia="Arial Unicode MS"/>
+          <w:rFonts w:ascii="Hiragino Sans GB" w:hAnsi="Hiragino Sans GB" w:eastAsia="Hiragino Sans GB"/>
           <w:b/>
           <w:color w:val="1F4D78"/>
           <w:sz w:val="21"/>
@@ -2012,7 +1992,7 @@
       </w:r>
       <w:r>
         <w:rPr>
-          <w:rFonts w:ascii="Arial Unicode MS" w:hAnsi="Arial Unicode MS" w:eastAsia="Arial Unicode MS"/>
+          <w:rFonts w:ascii="Hiragino Sans GB" w:hAnsi="Hiragino Sans GB" w:eastAsia="Hiragino Sans GB"/>
           <w:color w:val="182129"/>
           <w:sz w:val="21"/>
         </w:rPr>
@@ -2025,7 +2005,7 @@
       </w:pPr>
       <w:r>
         <w:rPr>
-          <w:rFonts w:ascii="Arial Unicode MS" w:hAnsi="Arial Unicode MS" w:eastAsia="Arial Unicode MS"/>
+          <w:rFonts w:ascii="Hiragino Sans GB" w:hAnsi="Hiragino Sans GB" w:eastAsia="Hiragino Sans GB"/>
           <w:b/>
           <w:color w:val="1F4D78"/>
           <w:sz w:val="21"/>
@@ -2034,7 +2014,7 @@
       </w:r>
       <w:r>
         <w:rPr>
-          <w:rFonts w:ascii="Arial Unicode MS" w:hAnsi="Arial Unicode MS" w:eastAsia="Arial Unicode MS"/>
+          <w:rFonts w:ascii="Hiragino Sans GB" w:hAnsi="Hiragino Sans GB" w:eastAsia="Hiragino Sans GB"/>
           <w:color w:val="182129"/>
           <w:sz w:val="21"/>
         </w:rPr>
@@ -2042,13 +2022,9 @@
       </w:r>
     </w:p>
     <w:p>
-      <w:r>
-        <w:br w:type="page"/>
-      </w:r>
-    </w:p>
-    <w:p>
       <w:pPr>
         <w:pStyle w:val="Heading2"/>
+        <w:pageBreakBefore/>
       </w:pPr>
       <w:r>
         <w:t>7. RBF 如何把空间距离变成特征</w:t>
@@ -2060,7 +2036,7 @@
       </w:pPr>
       <w:r>
         <w:rPr>
-          <w:rFonts w:ascii="Arial Unicode MS" w:hAnsi="Arial Unicode MS" w:eastAsia="Arial Unicode MS"/>
+          <w:rFonts w:ascii="Hiragino Sans GB" w:hAnsi="Hiragino Sans GB" w:eastAsia="Hiragino Sans GB"/>
           <w:b/>
           <w:color w:val="1F4D78"/>
           <w:sz w:val="21"/>
@@ -2069,7 +2045,7 @@
       </w:r>
       <w:r>
         <w:rPr>
-          <w:rFonts w:ascii="Arial Unicode MS" w:hAnsi="Arial Unicode MS" w:eastAsia="Arial Unicode MS"/>
+          <w:rFonts w:ascii="Hiragino Sans GB" w:hAnsi="Hiragino Sans GB" w:eastAsia="Hiragino Sans GB"/>
           <w:color w:val="182129"/>
           <w:sz w:val="21"/>
         </w:rPr>
@@ -2084,7 +2060,7 @@
       </w:pPr>
       <w:r>
         <w:rPr>
-          <w:rFonts w:ascii="Arial Unicode MS" w:hAnsi="Arial Unicode MS" w:eastAsia="Arial Unicode MS"/>
+          <w:rFonts w:ascii="Hiragino Sans GB" w:hAnsi="Hiragino Sans GB" w:eastAsia="Hiragino Sans GB"/>
           <w:b/>
           <w:color w:val="62246D"/>
           <w:sz w:val="18"/>
@@ -2094,7 +2070,7 @@
       </w:r>
       <w:r>
         <w:rPr>
-          <w:rFonts w:ascii="Calibri" w:hAnsi="Calibri" w:eastAsia="Arial Unicode MS"/>
+          <w:rFonts w:ascii="Arial" w:hAnsi="Arial" w:eastAsia="Hiragino Sans GB"/>
           <w:b w:val="0"/>
           <w:color w:val="182129"/>
           <w:sz w:val="21"/>
@@ -2108,7 +2084,7 @@
       </w:pPr>
       <w:r>
         <w:rPr>
-          <w:rFonts w:ascii="Arial Unicode MS" w:hAnsi="Arial Unicode MS" w:eastAsia="Arial Unicode MS"/>
+          <w:rFonts w:ascii="Hiragino Sans GB" w:hAnsi="Hiragino Sans GB" w:eastAsia="Hiragino Sans GB"/>
           <w:b/>
           <w:color w:val="1F4D78"/>
           <w:sz w:val="21"/>
@@ -2117,7 +2093,7 @@
       </w:r>
       <w:r>
         <w:rPr>
-          <w:rFonts w:ascii="Arial Unicode MS" w:hAnsi="Arial Unicode MS" w:eastAsia="Arial Unicode MS"/>
+          <w:rFonts w:ascii="Hiragino Sans GB" w:hAnsi="Hiragino Sans GB" w:eastAsia="Hiragino Sans GB"/>
           <w:color w:val="182129"/>
           <w:sz w:val="21"/>
         </w:rPr>
@@ -2130,7 +2106,7 @@
       </w:pPr>
       <w:r>
         <w:rPr>
-          <w:rFonts w:ascii="Arial Unicode MS" w:hAnsi="Arial Unicode MS" w:eastAsia="Arial Unicode MS"/>
+          <w:rFonts w:ascii="Hiragino Sans GB" w:hAnsi="Hiragino Sans GB" w:eastAsia="Hiragino Sans GB"/>
           <w:b/>
           <w:color w:val="1F4D78"/>
           <w:sz w:val="21"/>
@@ -2139,7 +2115,7 @@
       </w:r>
       <w:r>
         <w:rPr>
-          <w:rFonts w:ascii="Arial Unicode MS" w:hAnsi="Arial Unicode MS" w:eastAsia="Arial Unicode MS"/>
+          <w:rFonts w:ascii="Hiragino Sans GB" w:hAnsi="Hiragino Sans GB" w:eastAsia="Hiragino Sans GB"/>
           <w:color w:val="182129"/>
           <w:sz w:val="21"/>
         </w:rPr>
@@ -2160,7 +2136,7 @@
       </w:pPr>
       <w:r>
         <w:rPr>
-          <w:rFonts w:ascii="Arial Unicode MS" w:hAnsi="Arial Unicode MS" w:eastAsia="Arial Unicode MS"/>
+          <w:rFonts w:ascii="Hiragino Sans GB" w:hAnsi="Hiragino Sans GB" w:eastAsia="Hiragino Sans GB"/>
           <w:b/>
           <w:color w:val="1F4D78"/>
           <w:sz w:val="21"/>
@@ -2169,7 +2145,7 @@
       </w:r>
       <w:r>
         <w:rPr>
-          <w:rFonts w:ascii="Arial Unicode MS" w:hAnsi="Arial Unicode MS" w:eastAsia="Arial Unicode MS"/>
+          <w:rFonts w:ascii="Hiragino Sans GB" w:hAnsi="Hiragino Sans GB" w:eastAsia="Hiragino Sans GB"/>
           <w:color w:val="182129"/>
           <w:sz w:val="21"/>
         </w:rPr>
@@ -2184,7 +2160,7 @@
       </w:pPr>
       <w:r>
         <w:rPr>
-          <w:rFonts w:ascii="Arial Unicode MS" w:hAnsi="Arial Unicode MS" w:eastAsia="Arial Unicode MS"/>
+          <w:rFonts w:ascii="Hiragino Sans GB" w:hAnsi="Hiragino Sans GB" w:eastAsia="Hiragino Sans GB"/>
           <w:b/>
           <w:color w:val="62246D"/>
           <w:sz w:val="18"/>
@@ -2194,7 +2170,7 @@
       </w:r>
       <w:r>
         <w:rPr>
-          <w:rFonts w:ascii="Calibri" w:hAnsi="Calibri" w:eastAsia="Arial Unicode MS"/>
+          <w:rFonts w:ascii="Arial" w:hAnsi="Arial" w:eastAsia="Hiragino Sans GB"/>
           <w:b w:val="0"/>
           <w:color w:val="182129"/>
           <w:sz w:val="21"/>
@@ -2208,7 +2184,7 @@
       </w:pPr>
       <w:r>
         <w:rPr>
-          <w:rFonts w:ascii="Arial Unicode MS" w:hAnsi="Arial Unicode MS" w:eastAsia="Arial Unicode MS"/>
+          <w:rFonts w:ascii="Hiragino Sans GB" w:hAnsi="Hiragino Sans GB" w:eastAsia="Hiragino Sans GB"/>
           <w:b/>
           <w:color w:val="1F4D78"/>
           <w:sz w:val="21"/>
@@ -2217,7 +2193,7 @@
       </w:r>
       <w:r>
         <w:rPr>
-          <w:rFonts w:ascii="Arial Unicode MS" w:hAnsi="Arial Unicode MS" w:eastAsia="Arial Unicode MS"/>
+          <w:rFonts w:ascii="Hiragino Sans GB" w:hAnsi="Hiragino Sans GB" w:eastAsia="Hiragino Sans GB"/>
           <w:color w:val="182129"/>
           <w:sz w:val="21"/>
         </w:rPr>
@@ -2230,7 +2206,7 @@
       </w:pPr>
       <w:r>
         <w:rPr>
-          <w:rFonts w:ascii="Arial Unicode MS" w:hAnsi="Arial Unicode MS" w:eastAsia="Arial Unicode MS"/>
+          <w:rFonts w:ascii="Hiragino Sans GB" w:hAnsi="Hiragino Sans GB" w:eastAsia="Hiragino Sans GB"/>
           <w:b/>
           <w:color w:val="1F4D78"/>
           <w:sz w:val="21"/>
@@ -2239,7 +2215,7 @@
       </w:r>
       <w:r>
         <w:rPr>
-          <w:rFonts w:ascii="Arial Unicode MS" w:hAnsi="Arial Unicode MS" w:eastAsia="Arial Unicode MS"/>
+          <w:rFonts w:ascii="Hiragino Sans GB" w:hAnsi="Hiragino Sans GB" w:eastAsia="Hiragino Sans GB"/>
           <w:color w:val="182129"/>
           <w:sz w:val="21"/>
         </w:rPr>
@@ -2247,11 +2223,6 @@
       </w:r>
     </w:p>
     <w:p>
-      <w:r>
-        <w:br w:type="page"/>
-      </w:r>
-    </w:p>
-    <w:p>
       <w:pPr>
         <w:pStyle w:val="Heading2"/>
       </w:pPr>
@@ -2265,7 +2236,7 @@
       </w:pPr>
       <w:r>
         <w:rPr>
-          <w:rFonts w:ascii="Arial Unicode MS" w:hAnsi="Arial Unicode MS" w:eastAsia="Arial Unicode MS"/>
+          <w:rFonts w:ascii="Hiragino Sans GB" w:hAnsi="Hiragino Sans GB" w:eastAsia="Hiragino Sans GB"/>
           <w:b/>
           <w:color w:val="1F4D78"/>
           <w:sz w:val="21"/>
@@ -2274,7 +2245,7 @@
       </w:r>
       <w:r>
         <w:rPr>
-          <w:rFonts w:ascii="Arial Unicode MS" w:hAnsi="Arial Unicode MS" w:eastAsia="Arial Unicode MS"/>
+          <w:rFonts w:ascii="Hiragino Sans GB" w:hAnsi="Hiragino Sans GB" w:eastAsia="Hiragino Sans GB"/>
           <w:color w:val="182129"/>
           <w:sz w:val="21"/>
         </w:rPr>
@@ -2289,7 +2260,7 @@
       </w:pPr>
       <w:r>
         <w:rPr>
-          <w:rFonts w:ascii="Arial Unicode MS" w:hAnsi="Arial Unicode MS" w:eastAsia="Arial Unicode MS"/>
+          <w:rFonts w:ascii="Hiragino Sans GB" w:hAnsi="Hiragino Sans GB" w:eastAsia="Hiragino Sans GB"/>
           <w:b/>
           <w:color w:val="62246D"/>
           <w:sz w:val="18"/>
@@ -2299,7 +2270,7 @@
       </w:r>
       <w:r>
         <w:rPr>
-          <w:rFonts w:ascii="Calibri" w:hAnsi="Calibri" w:eastAsia="Arial Unicode MS"/>
+          <w:rFonts w:ascii="Arial" w:hAnsi="Arial" w:eastAsia="Hiragino Sans GB"/>
           <w:b w:val="0"/>
           <w:color w:val="182129"/>
           <w:sz w:val="21"/>
@@ -2313,7 +2284,7 @@
       </w:pPr>
       <w:r>
         <w:rPr>
-          <w:rFonts w:ascii="Arial Unicode MS" w:hAnsi="Arial Unicode MS" w:eastAsia="Arial Unicode MS"/>
+          <w:rFonts w:ascii="Hiragino Sans GB" w:hAnsi="Hiragino Sans GB" w:eastAsia="Hiragino Sans GB"/>
           <w:b/>
           <w:color w:val="1F4D78"/>
           <w:sz w:val="21"/>
@@ -2322,7 +2293,7 @@
       </w:r>
       <w:r>
         <w:rPr>
-          <w:rFonts w:ascii="Arial Unicode MS" w:hAnsi="Arial Unicode MS" w:eastAsia="Arial Unicode MS"/>
+          <w:rFonts w:ascii="Hiragino Sans GB" w:hAnsi="Hiragino Sans GB" w:eastAsia="Hiragino Sans GB"/>
           <w:color w:val="182129"/>
           <w:sz w:val="21"/>
         </w:rPr>
@@ -2335,7 +2306,7 @@
       </w:pPr>
       <w:r>
         <w:rPr>
-          <w:rFonts w:ascii="Arial Unicode MS" w:hAnsi="Arial Unicode MS" w:eastAsia="Arial Unicode MS"/>
+          <w:rFonts w:ascii="Hiragino Sans GB" w:hAnsi="Hiragino Sans GB" w:eastAsia="Hiragino Sans GB"/>
           <w:b/>
           <w:color w:val="1F4D78"/>
           <w:sz w:val="21"/>
@@ -2344,7 +2315,7 @@
       </w:r>
       <w:r>
         <w:rPr>
-          <w:rFonts w:ascii="Arial Unicode MS" w:hAnsi="Arial Unicode MS" w:eastAsia="Arial Unicode MS"/>
+          <w:rFonts w:ascii="Hiragino Sans GB" w:hAnsi="Hiragino Sans GB" w:eastAsia="Hiragino Sans GB"/>
           <w:color w:val="182129"/>
           <w:sz w:val="21"/>
         </w:rPr>
@@ -2365,7 +2336,7 @@
       </w:pPr>
       <w:r>
         <w:rPr>
-          <w:rFonts w:ascii="Arial Unicode MS" w:hAnsi="Arial Unicode MS" w:eastAsia="Arial Unicode MS"/>
+          <w:rFonts w:ascii="Hiragino Sans GB" w:hAnsi="Hiragino Sans GB" w:eastAsia="Hiragino Sans GB"/>
           <w:b/>
           <w:color w:val="1F4D78"/>
           <w:sz w:val="21"/>
@@ -2374,7 +2345,7 @@
       </w:r>
       <w:r>
         <w:rPr>
-          <w:rFonts w:ascii="Arial Unicode MS" w:hAnsi="Arial Unicode MS" w:eastAsia="Arial Unicode MS"/>
+          <w:rFonts w:ascii="Hiragino Sans GB" w:hAnsi="Hiragino Sans GB" w:eastAsia="Hiragino Sans GB"/>
           <w:color w:val="182129"/>
           <w:sz w:val="21"/>
         </w:rPr>
@@ -2389,7 +2360,7 @@
       </w:pPr>
       <w:r>
         <w:rPr>
-          <w:rFonts w:ascii="Arial Unicode MS" w:hAnsi="Arial Unicode MS" w:eastAsia="Arial Unicode MS"/>
+          <w:rFonts w:ascii="Hiragino Sans GB" w:hAnsi="Hiragino Sans GB" w:eastAsia="Hiragino Sans GB"/>
           <w:b/>
           <w:color w:val="62246D"/>
           <w:sz w:val="18"/>
@@ -2399,7 +2370,7 @@
       </w:r>
       <w:r>
         <w:rPr>
-          <w:rFonts w:ascii="Calibri" w:hAnsi="Calibri" w:eastAsia="Arial Unicode MS"/>
+          <w:rFonts w:ascii="Arial" w:hAnsi="Arial" w:eastAsia="Hiragino Sans GB"/>
           <w:b w:val="0"/>
           <w:color w:val="182129"/>
           <w:sz w:val="21"/>
@@ -2413,7 +2384,7 @@
       </w:pPr>
       <w:r>
         <w:rPr>
-          <w:rFonts w:ascii="Arial Unicode MS" w:hAnsi="Arial Unicode MS" w:eastAsia="Arial Unicode MS"/>
+          <w:rFonts w:ascii="Hiragino Sans GB" w:hAnsi="Hiragino Sans GB" w:eastAsia="Hiragino Sans GB"/>
           <w:b/>
           <w:color w:val="1F4D78"/>
           <w:sz w:val="21"/>
@@ -2422,7 +2393,7 @@
       </w:r>
       <w:r>
         <w:rPr>
-          <w:rFonts w:ascii="Arial Unicode MS" w:hAnsi="Arial Unicode MS" w:eastAsia="Arial Unicode MS"/>
+          <w:rFonts w:ascii="Hiragino Sans GB" w:hAnsi="Hiragino Sans GB" w:eastAsia="Hiragino Sans GB"/>
           <w:color w:val="182129"/>
           <w:sz w:val="21"/>
         </w:rPr>
@@ -2435,7 +2406,7 @@
       </w:pPr>
       <w:r>
         <w:rPr>
-          <w:rFonts w:ascii="Arial Unicode MS" w:hAnsi="Arial Unicode MS" w:eastAsia="Arial Unicode MS"/>
+          <w:rFonts w:ascii="Hiragino Sans GB" w:hAnsi="Hiragino Sans GB" w:eastAsia="Hiragino Sans GB"/>
           <w:b/>
           <w:color w:val="1F4D78"/>
           <w:sz w:val="21"/>
@@ -2444,7 +2415,7 @@
       </w:r>
       <w:r>
         <w:rPr>
-          <w:rFonts w:ascii="Arial Unicode MS" w:hAnsi="Arial Unicode MS" w:eastAsia="Arial Unicode MS"/>
+          <w:rFonts w:ascii="Hiragino Sans GB" w:hAnsi="Hiragino Sans GB" w:eastAsia="Hiragino Sans GB"/>
           <w:color w:val="182129"/>
           <w:sz w:val="21"/>
         </w:rPr>
@@ -2498,7 +2469,7 @@
             </w:pPr>
             <w:r>
               <w:rPr>
-                <w:rFonts w:ascii="Arial Unicode MS" w:hAnsi="Arial Unicode MS" w:eastAsia="Arial Unicode MS"/>
+                <w:rFonts w:ascii="Hiragino Sans GB" w:hAnsi="Hiragino Sans GB" w:eastAsia="Hiragino Sans GB"/>
                 <w:b/>
                 <w:color w:val="1F4D78"/>
                 <w:sz w:val="18"/>
@@ -2526,7 +2497,7 @@
             </w:pPr>
             <w:r>
               <w:rPr>
-                <w:rFonts w:ascii="Calibri" w:hAnsi="Calibri" w:eastAsia="Arial Unicode MS"/>
+                <w:rFonts w:ascii="Arial" w:hAnsi="Arial" w:eastAsia="Hiragino Sans GB"/>
                 <w:b/>
                 <w:color w:val="1F4D78"/>
                 <w:sz w:val="18"/>
@@ -2554,7 +2525,7 @@
             </w:pPr>
             <w:r>
               <w:rPr>
-                <w:rFonts w:ascii="Calibri" w:hAnsi="Calibri" w:eastAsia="Arial Unicode MS"/>
+                <w:rFonts w:ascii="Arial" w:hAnsi="Arial" w:eastAsia="Hiragino Sans GB"/>
                 <w:b/>
                 <w:color w:val="1F4D78"/>
                 <w:sz w:val="18"/>
@@ -2582,7 +2553,7 @@
             </w:pPr>
             <w:r>
               <w:rPr>
-                <w:rFonts w:ascii="Calibri" w:hAnsi="Calibri" w:eastAsia="Arial Unicode MS"/>
+                <w:rFonts w:ascii="Arial" w:hAnsi="Arial" w:eastAsia="Hiragino Sans GB"/>
                 <w:b/>
                 <w:color w:val="1F4D78"/>
                 <w:sz w:val="18"/>
@@ -2610,7 +2581,7 @@
             </w:pPr>
             <w:r>
               <w:rPr>
-                <w:rFonts w:ascii="Arial Unicode MS" w:hAnsi="Arial Unicode MS" w:eastAsia="Arial Unicode MS"/>
+                <w:rFonts w:ascii="Hiragino Sans GB" w:hAnsi="Hiragino Sans GB" w:eastAsia="Hiragino Sans GB"/>
                 <w:b/>
                 <w:color w:val="1F4D78"/>
                 <w:sz w:val="18"/>
@@ -2639,7 +2610,7 @@
             </w:pPr>
             <w:r>
               <w:rPr>
-                <w:rFonts w:ascii="Calibri" w:hAnsi="Calibri" w:eastAsia="Arial Unicode MS"/>
+                <w:rFonts w:ascii="Arial" w:hAnsi="Arial" w:eastAsia="Hiragino Sans GB"/>
                 <w:color w:val="182129"/>
                 <w:sz w:val="17"/>
               </w:rPr>
@@ -2665,7 +2636,7 @@
             </w:pPr>
             <w:r>
               <w:rPr>
-                <w:rFonts w:ascii="Calibri" w:hAnsi="Calibri" w:eastAsia="Arial Unicode MS"/>
+                <w:rFonts w:ascii="Arial" w:hAnsi="Arial" w:eastAsia="Hiragino Sans GB"/>
                 <w:color w:val="182129"/>
                 <w:sz w:val="17"/>
               </w:rPr>
@@ -2691,7 +2662,7 @@
             </w:pPr>
             <w:r>
               <w:rPr>
-                <w:rFonts w:ascii="Calibri" w:hAnsi="Calibri" w:eastAsia="Arial Unicode MS"/>
+                <w:rFonts w:ascii="Arial" w:hAnsi="Arial" w:eastAsia="Hiragino Sans GB"/>
                 <w:color w:val="182129"/>
                 <w:sz w:val="17"/>
               </w:rPr>
@@ -2717,7 +2688,7 @@
             </w:pPr>
             <w:r>
               <w:rPr>
-                <w:rFonts w:ascii="Calibri" w:hAnsi="Calibri" w:eastAsia="Arial Unicode MS"/>
+                <w:rFonts w:ascii="Arial" w:hAnsi="Arial" w:eastAsia="Hiragino Sans GB"/>
                 <w:color w:val="182129"/>
                 <w:sz w:val="17"/>
               </w:rPr>
@@ -2743,7 +2714,7 @@
             </w:pPr>
             <w:r>
               <w:rPr>
-                <w:rFonts w:ascii="Arial Unicode MS" w:hAnsi="Arial Unicode MS" w:eastAsia="Arial Unicode MS"/>
+                <w:rFonts w:ascii="Hiragino Sans GB" w:hAnsi="Hiragino Sans GB" w:eastAsia="Hiragino Sans GB"/>
                 <w:color w:val="182129"/>
                 <w:sz w:val="17"/>
               </w:rPr>
@@ -2771,7 +2742,7 @@
             </w:pPr>
             <w:r>
               <w:rPr>
-                <w:rFonts w:ascii="Calibri" w:hAnsi="Calibri" w:eastAsia="Arial Unicode MS"/>
+                <w:rFonts w:ascii="Arial" w:hAnsi="Arial" w:eastAsia="Hiragino Sans GB"/>
                 <w:color w:val="182129"/>
                 <w:sz w:val="17"/>
               </w:rPr>
@@ -2797,7 +2768,7 @@
             </w:pPr>
             <w:r>
               <w:rPr>
-                <w:rFonts w:ascii="Calibri" w:hAnsi="Calibri" w:eastAsia="Arial Unicode MS"/>
+                <w:rFonts w:ascii="Arial" w:hAnsi="Arial" w:eastAsia="Hiragino Sans GB"/>
                 <w:color w:val="182129"/>
                 <w:sz w:val="17"/>
               </w:rPr>
@@ -2823,7 +2794,7 @@
             </w:pPr>
             <w:r>
               <w:rPr>
-                <w:rFonts w:ascii="Calibri" w:hAnsi="Calibri" w:eastAsia="Arial Unicode MS"/>
+                <w:rFonts w:ascii="Arial" w:hAnsi="Arial" w:eastAsia="Hiragino Sans GB"/>
                 <w:color w:val="182129"/>
                 <w:sz w:val="17"/>
               </w:rPr>
@@ -2849,7 +2820,7 @@
             </w:pPr>
             <w:r>
               <w:rPr>
-                <w:rFonts w:ascii="Calibri" w:hAnsi="Calibri" w:eastAsia="Arial Unicode MS"/>
+                <w:rFonts w:ascii="Arial" w:hAnsi="Arial" w:eastAsia="Hiragino Sans GB"/>
                 <w:color w:val="182129"/>
                 <w:sz w:val="17"/>
               </w:rPr>
@@ -2875,7 +2846,7 @@
             </w:pPr>
             <w:r>
               <w:rPr>
-                <w:rFonts w:ascii="Arial Unicode MS" w:hAnsi="Arial Unicode MS" w:eastAsia="Arial Unicode MS"/>
+                <w:rFonts w:ascii="Hiragino Sans GB" w:hAnsi="Hiragino Sans GB" w:eastAsia="Hiragino Sans GB"/>
                 <w:color w:val="182129"/>
                 <w:sz w:val="17"/>
               </w:rPr>
@@ -2903,7 +2874,7 @@
             </w:pPr>
             <w:r>
               <w:rPr>
-                <w:rFonts w:ascii="Calibri" w:hAnsi="Calibri" w:eastAsia="Arial Unicode MS"/>
+                <w:rFonts w:ascii="Arial" w:hAnsi="Arial" w:eastAsia="Hiragino Sans GB"/>
                 <w:color w:val="182129"/>
                 <w:sz w:val="17"/>
               </w:rPr>
@@ -2929,7 +2900,7 @@
             </w:pPr>
             <w:r>
               <w:rPr>
-                <w:rFonts w:ascii="Calibri" w:hAnsi="Calibri" w:eastAsia="Arial Unicode MS"/>
+                <w:rFonts w:ascii="Arial" w:hAnsi="Arial" w:eastAsia="Hiragino Sans GB"/>
                 <w:color w:val="182129"/>
                 <w:sz w:val="17"/>
               </w:rPr>
@@ -2955,7 +2926,7 @@
             </w:pPr>
             <w:r>
               <w:rPr>
-                <w:rFonts w:ascii="Calibri" w:hAnsi="Calibri" w:eastAsia="Arial Unicode MS"/>
+                <w:rFonts w:ascii="Arial" w:hAnsi="Arial" w:eastAsia="Hiragino Sans GB"/>
                 <w:color w:val="182129"/>
                 <w:sz w:val="17"/>
               </w:rPr>
@@ -2981,7 +2952,7 @@
             </w:pPr>
             <w:r>
               <w:rPr>
-                <w:rFonts w:ascii="Calibri" w:hAnsi="Calibri" w:eastAsia="Arial Unicode MS"/>
+                <w:rFonts w:ascii="Arial" w:hAnsi="Arial" w:eastAsia="Hiragino Sans GB"/>
                 <w:color w:val="182129"/>
                 <w:sz w:val="17"/>
               </w:rPr>
@@ -3007,7 +2978,7 @@
             </w:pPr>
             <w:r>
               <w:rPr>
-                <w:rFonts w:ascii="Arial Unicode MS" w:hAnsi="Arial Unicode MS" w:eastAsia="Arial Unicode MS"/>
+                <w:rFonts w:ascii="Hiragino Sans GB" w:hAnsi="Hiragino Sans GB" w:eastAsia="Hiragino Sans GB"/>
                 <w:color w:val="182129"/>
                 <w:sz w:val="17"/>
               </w:rPr>
@@ -3035,7 +3006,7 @@
             </w:pPr>
             <w:r>
               <w:rPr>
-                <w:rFonts w:ascii="Calibri" w:hAnsi="Calibri" w:eastAsia="Arial Unicode MS"/>
+                <w:rFonts w:ascii="Arial" w:hAnsi="Arial" w:eastAsia="Hiragino Sans GB"/>
                 <w:color w:val="182129"/>
                 <w:sz w:val="17"/>
               </w:rPr>
@@ -3061,7 +3032,7 @@
             </w:pPr>
             <w:r>
               <w:rPr>
-                <w:rFonts w:ascii="Calibri" w:hAnsi="Calibri" w:eastAsia="Arial Unicode MS"/>
+                <w:rFonts w:ascii="Arial" w:hAnsi="Arial" w:eastAsia="Hiragino Sans GB"/>
                 <w:color w:val="182129"/>
                 <w:sz w:val="17"/>
               </w:rPr>
@@ -3087,7 +3058,7 @@
             </w:pPr>
             <w:r>
               <w:rPr>
-                <w:rFonts w:ascii="Calibri" w:hAnsi="Calibri" w:eastAsia="Arial Unicode MS"/>
+                <w:rFonts w:ascii="Arial" w:hAnsi="Arial" w:eastAsia="Hiragino Sans GB"/>
                 <w:color w:val="182129"/>
                 <w:sz w:val="17"/>
               </w:rPr>
@@ -3113,7 +3084,7 @@
             </w:pPr>
             <w:r>
               <w:rPr>
-                <w:rFonts w:ascii="Calibri" w:hAnsi="Calibri" w:eastAsia="Arial Unicode MS"/>
+                <w:rFonts w:ascii="Arial" w:hAnsi="Arial" w:eastAsia="Hiragino Sans GB"/>
                 <w:color w:val="182129"/>
                 <w:sz w:val="17"/>
               </w:rPr>
@@ -3139,7 +3110,7 @@
             </w:pPr>
             <w:r>
               <w:rPr>
-                <w:rFonts w:ascii="Arial Unicode MS" w:hAnsi="Arial Unicode MS" w:eastAsia="Arial Unicode MS"/>
+                <w:rFonts w:ascii="Hiragino Sans GB" w:hAnsi="Hiragino Sans GB" w:eastAsia="Hiragino Sans GB"/>
                 <w:color w:val="182129"/>
                 <w:sz w:val="17"/>
               </w:rPr>
@@ -3162,7 +3133,7 @@
       </w:pPr>
       <w:r>
         <w:rPr>
-          <w:rFonts w:ascii="Arial Unicode MS" w:hAnsi="Arial Unicode MS" w:eastAsia="Arial Unicode MS"/>
+          <w:rFonts w:ascii="Hiragino Sans GB" w:hAnsi="Hiragino Sans GB" w:eastAsia="Hiragino Sans GB"/>
           <w:b/>
           <w:color w:val="007F82"/>
           <w:sz w:val="18"/>
@@ -3172,7 +3143,7 @@
       </w:r>
       <w:r>
         <w:rPr>
-          <w:rFonts w:ascii="Arial Unicode MS" w:hAnsi="Arial Unicode MS" w:eastAsia="Arial Unicode MS"/>
+          <w:rFonts w:ascii="Hiragino Sans GB" w:hAnsi="Hiragino Sans GB" w:eastAsia="Hiragino Sans GB"/>
           <w:b w:val="0"/>
           <w:color w:val="182129"/>
           <w:sz w:val="21"/>
@@ -3181,13 +3152,101 @@
       </w:r>
     </w:p>
     <w:p>
+      <w:pPr>
+        <w:pStyle w:val="Heading2"/>
+      </w:pPr>
       <w:r>
-        <w:br w:type="page"/>
+        <w:t>一分钟原理复述</w:t>
       </w:r>
     </w:p>
     <w:p>
       <w:pPr>
+        <w:pStyle w:val="ListBullet"/>
+        <w:spacing w:after="60"/>
+      </w:pPr>
+      <w:r>
+        <w:rPr>
+          <w:rFonts w:ascii="Hiragino Sans GB" w:hAnsi="Hiragino Sans GB" w:eastAsia="Hiragino Sans GB"/>
+          <w:color w:val="182129"/>
+          <w:sz w:val="20"/>
+        </w:rPr>
+        <w:t>先把单条事件汇总为社区—月份计数，使时间和空间进入同一观察单位。</w:t>
+      </w:r>
+    </w:p>
+    <w:p>
+      <w:pPr>
+        <w:pStyle w:val="ListBullet"/>
+        <w:spacing w:after="60"/>
+      </w:pPr>
+      <w:r>
+        <w:rPr>
+          <w:rFonts w:ascii="Hiragino Sans GB" w:hAnsi="Hiragino Sans GB" w:eastAsia="Hiragino Sans GB"/>
+          <w:color w:val="182129"/>
+          <w:sz w:val="20"/>
+        </w:rPr>
+        <w:t>用趋势图、热点图、热力图和动画分别回答什么时候高、哪里高、哪里在什么时候变高。</w:t>
+      </w:r>
+    </w:p>
+    <w:p>
+      <w:pPr>
+        <w:pStyle w:val="ListBullet"/>
+        <w:spacing w:after="60"/>
+      </w:pPr>
+      <w:r>
+        <w:rPr>
+          <w:rFonts w:ascii="Hiragino Sans GB" w:hAnsi="Hiragino Sans GB" w:eastAsia="Hiragino Sans GB"/>
+          <w:color w:val="182129"/>
+          <w:sz w:val="20"/>
+        </w:rPr>
+        <w:t>用log(1+y)压缩极端计数，再在预测后返回原始计数尺度评价。</w:t>
+      </w:r>
+    </w:p>
+    <w:p>
+      <w:pPr>
+        <w:pStyle w:val="ListBullet"/>
+        <w:spacing w:after="60"/>
+      </w:pPr>
+      <w:r>
+        <w:rPr>
+          <w:rFonts w:ascii="Hiragino Sans GB" w:hAnsi="Hiragino Sans GB" w:eastAsia="Hiragino Sans GB"/>
+          <w:color w:val="182129"/>
+          <w:sz w:val="20"/>
+        </w:rPr>
+        <w:t>用B-spline、sine/cosine和RBF把长期、季节和空间结构变成设计矩阵的列。</w:t>
+      </w:r>
+    </w:p>
+    <w:p>
+      <w:pPr>
+        <w:pStyle w:val="ListBullet"/>
+        <w:spacing w:after="60"/>
+      </w:pPr>
+      <w:r>
+        <w:rPr>
+          <w:rFonts w:ascii="Hiragino Sans GB" w:hAnsi="Hiragino Sans GB" w:eastAsia="Hiragino Sans GB"/>
+          <w:color w:val="182129"/>
+          <w:sz w:val="20"/>
+        </w:rPr>
+        <w:t>Basis OLS完成Task 4；Basis Ridge在同一线性模型上加入L2惩罚以提高稳定性。</w:t>
+      </w:r>
+    </w:p>
+    <w:p>
+      <w:pPr>
+        <w:pStyle w:val="ListBullet"/>
+        <w:spacing w:after="60"/>
+      </w:pPr>
+      <w:r>
+        <w:rPr>
+          <w:rFonts w:ascii="Hiragino Sans GB" w:hAnsi="Hiragino Sans GB" w:eastAsia="Hiragino Sans GB"/>
+          <w:color w:val="182129"/>
+          <w:sz w:val="20"/>
+        </w:rPr>
+        <w:t>按时间划分训练、验证和测试，并与简单基线比较，才能说明模型对未来数据是否真正有用。</w:t>
+      </w:r>
+    </w:p>
+    <w:p>
+      <w:pPr>
         <w:pStyle w:val="Heading1"/>
+        <w:pageBreakBefore/>
       </w:pPr>
       <w:r>
         <w:t>Part III · 答辩速查</w:t>
@@ -3201,7 +3260,7 @@
       </w:pPr>
       <w:r>
         <w:rPr>
-          <w:rFonts w:ascii="Arial Unicode MS" w:hAnsi="Arial Unicode MS" w:eastAsia="Arial Unicode MS"/>
+          <w:rFonts w:ascii="Hiragino Sans GB" w:hAnsi="Hiragino Sans GB" w:eastAsia="Hiragino Sans GB"/>
           <w:b w:val="0"/>
           <w:i/>
           <w:color w:val="57626E"/>
@@ -3226,7 +3285,7 @@
       </w:pPr>
       <w:r>
         <w:rPr>
-          <w:rFonts w:ascii="Arial Unicode MS" w:hAnsi="Arial Unicode MS" w:eastAsia="Arial Unicode MS"/>
+          <w:rFonts w:ascii="Hiragino Sans GB" w:hAnsi="Hiragino Sans GB" w:eastAsia="Hiragino Sans GB"/>
           <w:b/>
           <w:color w:val="007F82"/>
           <w:sz w:val="18"/>
@@ -3236,7 +3295,7 @@
       </w:r>
       <w:r>
         <w:rPr>
-          <w:rFonts w:ascii="Arial Unicode MS" w:hAnsi="Arial Unicode MS" w:eastAsia="Arial Unicode MS"/>
+          <w:rFonts w:ascii="Hiragino Sans GB" w:hAnsi="Hiragino Sans GB" w:eastAsia="Hiragino Sans GB"/>
           <w:b w:val="0"/>
           <w:color w:val="182129"/>
           <w:sz w:val="21"/>
@@ -3250,7 +3309,7 @@
       </w:pPr>
       <w:r>
         <w:rPr>
-          <w:rFonts w:ascii="Arial Unicode MS" w:hAnsi="Arial Unicode MS" w:eastAsia="Arial Unicode MS"/>
+          <w:rFonts w:ascii="Hiragino Sans GB" w:hAnsi="Hiragino Sans GB" w:eastAsia="Hiragino Sans GB"/>
           <w:b/>
           <w:color w:val="1F4D78"/>
           <w:sz w:val="21"/>
@@ -3259,7 +3318,7 @@
       </w:r>
       <w:r>
         <w:rPr>
-          <w:rFonts w:ascii="Arial Unicode MS" w:hAnsi="Arial Unicode MS" w:eastAsia="Arial Unicode MS"/>
+          <w:rFonts w:ascii="Hiragino Sans GB" w:hAnsi="Hiragino Sans GB" w:eastAsia="Hiragino Sans GB"/>
           <w:color w:val="182129"/>
           <w:sz w:val="21"/>
         </w:rPr>
@@ -3282,7 +3341,7 @@
       </w:pPr>
       <w:r>
         <w:rPr>
-          <w:rFonts w:ascii="Arial Unicode MS" w:hAnsi="Arial Unicode MS" w:eastAsia="Arial Unicode MS"/>
+          <w:rFonts w:ascii="Hiragino Sans GB" w:hAnsi="Hiragino Sans GB" w:eastAsia="Hiragino Sans GB"/>
           <w:b/>
           <w:color w:val="007F82"/>
           <w:sz w:val="18"/>
@@ -3292,7 +3351,7 @@
       </w:r>
       <w:r>
         <w:rPr>
-          <w:rFonts w:ascii="Arial Unicode MS" w:hAnsi="Arial Unicode MS" w:eastAsia="Arial Unicode MS"/>
+          <w:rFonts w:ascii="Hiragino Sans GB" w:hAnsi="Hiragino Sans GB" w:eastAsia="Hiragino Sans GB"/>
           <w:b w:val="0"/>
           <w:color w:val="182129"/>
           <w:sz w:val="21"/>
@@ -3306,7 +3365,7 @@
       </w:pPr>
       <w:r>
         <w:rPr>
-          <w:rFonts w:ascii="Arial Unicode MS" w:hAnsi="Arial Unicode MS" w:eastAsia="Arial Unicode MS"/>
+          <w:rFonts w:ascii="Hiragino Sans GB" w:hAnsi="Hiragino Sans GB" w:eastAsia="Hiragino Sans GB"/>
           <w:b/>
           <w:color w:val="1F4D78"/>
           <w:sz w:val="21"/>
@@ -3315,7 +3374,7 @@
       </w:r>
       <w:r>
         <w:rPr>
-          <w:rFonts w:ascii="Arial Unicode MS" w:hAnsi="Arial Unicode MS" w:eastAsia="Arial Unicode MS"/>
+          <w:rFonts w:ascii="Hiragino Sans GB" w:hAnsi="Hiragino Sans GB" w:eastAsia="Hiragino Sans GB"/>
           <w:color w:val="182129"/>
           <w:sz w:val="21"/>
         </w:rPr>
@@ -3338,7 +3397,7 @@
       </w:pPr>
       <w:r>
         <w:rPr>
-          <w:rFonts w:ascii="Arial Unicode MS" w:hAnsi="Arial Unicode MS" w:eastAsia="Arial Unicode MS"/>
+          <w:rFonts w:ascii="Hiragino Sans GB" w:hAnsi="Hiragino Sans GB" w:eastAsia="Hiragino Sans GB"/>
           <w:b/>
           <w:color w:val="007F82"/>
           <w:sz w:val="18"/>
@@ -3348,7 +3407,7 @@
       </w:r>
       <w:r>
         <w:rPr>
-          <w:rFonts w:ascii="Arial Unicode MS" w:hAnsi="Arial Unicode MS" w:eastAsia="Arial Unicode MS"/>
+          <w:rFonts w:ascii="Hiragino Sans GB" w:hAnsi="Hiragino Sans GB" w:eastAsia="Hiragino Sans GB"/>
           <w:b w:val="0"/>
           <w:color w:val="182129"/>
           <w:sz w:val="21"/>
@@ -3362,7 +3421,7 @@
       </w:pPr>
       <w:r>
         <w:rPr>
-          <w:rFonts w:ascii="Arial Unicode MS" w:hAnsi="Arial Unicode MS" w:eastAsia="Arial Unicode MS"/>
+          <w:rFonts w:ascii="Hiragino Sans GB" w:hAnsi="Hiragino Sans GB" w:eastAsia="Hiragino Sans GB"/>
           <w:b/>
           <w:color w:val="1F4D78"/>
           <w:sz w:val="21"/>
@@ -3371,7 +3430,7 @@
       </w:r>
       <w:r>
         <w:rPr>
-          <w:rFonts w:ascii="Arial Unicode MS" w:hAnsi="Arial Unicode MS" w:eastAsia="Arial Unicode MS"/>
+          <w:rFonts w:ascii="Hiragino Sans GB" w:hAnsi="Hiragino Sans GB" w:eastAsia="Hiragino Sans GB"/>
           <w:color w:val="182129"/>
           <w:sz w:val="21"/>
         </w:rPr>
@@ -3379,11 +3438,6 @@
       </w:r>
     </w:p>
     <w:p>
-      <w:r>
-        <w:br w:type="page"/>
-      </w:r>
-    </w:p>
-    <w:p>
       <w:pPr>
         <w:pStyle w:val="Heading2"/>
       </w:pPr>
@@ -3399,7 +3453,7 @@
       </w:pPr>
       <w:r>
         <w:rPr>
-          <w:rFonts w:ascii="Arial Unicode MS" w:hAnsi="Arial Unicode MS" w:eastAsia="Arial Unicode MS"/>
+          <w:rFonts w:ascii="Hiragino Sans GB" w:hAnsi="Hiragino Sans GB" w:eastAsia="Hiragino Sans GB"/>
           <w:b/>
           <w:color w:val="007F82"/>
           <w:sz w:val="18"/>
@@ -3409,7 +3463,7 @@
       </w:r>
       <w:r>
         <w:rPr>
-          <w:rFonts w:ascii="Arial Unicode MS" w:hAnsi="Arial Unicode MS" w:eastAsia="Arial Unicode MS"/>
+          <w:rFonts w:ascii="Hiragino Sans GB" w:hAnsi="Hiragino Sans GB" w:eastAsia="Hiragino Sans GB"/>
           <w:b w:val="0"/>
           <w:color w:val="182129"/>
           <w:sz w:val="21"/>
@@ -3423,7 +3477,7 @@
       </w:pPr>
       <w:r>
         <w:rPr>
-          <w:rFonts w:ascii="Arial Unicode MS" w:hAnsi="Arial Unicode MS" w:eastAsia="Arial Unicode MS"/>
+          <w:rFonts w:ascii="Hiragino Sans GB" w:hAnsi="Hiragino Sans GB" w:eastAsia="Hiragino Sans GB"/>
           <w:b/>
           <w:color w:val="1F4D78"/>
           <w:sz w:val="21"/>
@@ -3432,7 +3486,7 @@
       </w:r>
       <w:r>
         <w:rPr>
-          <w:rFonts w:ascii="Arial Unicode MS" w:hAnsi="Arial Unicode MS" w:eastAsia="Arial Unicode MS"/>
+          <w:rFonts w:ascii="Hiragino Sans GB" w:hAnsi="Hiragino Sans GB" w:eastAsia="Hiragino Sans GB"/>
           <w:color w:val="182129"/>
           <w:sz w:val="21"/>
         </w:rPr>
@@ -3442,6 +3496,7 @@
     <w:p>
       <w:pPr>
         <w:pStyle w:val="Heading2"/>
+        <w:pageBreakBefore/>
       </w:pPr>
       <w:r>
         <w:t>5. R²=0.757是否等于75.7%的准确率？</w:t>
@@ -3455,7 +3510,7 @@
       </w:pPr>
       <w:r>
         <w:rPr>
-          <w:rFonts w:ascii="Arial Unicode MS" w:hAnsi="Arial Unicode MS" w:eastAsia="Arial Unicode MS"/>
+          <w:rFonts w:ascii="Hiragino Sans GB" w:hAnsi="Hiragino Sans GB" w:eastAsia="Hiragino Sans GB"/>
           <w:b/>
           <w:color w:val="007F82"/>
           <w:sz w:val="18"/>
@@ -3465,7 +3520,7 @@
       </w:r>
       <w:r>
         <w:rPr>
-          <w:rFonts w:ascii="Arial Unicode MS" w:hAnsi="Arial Unicode MS" w:eastAsia="Arial Unicode MS"/>
+          <w:rFonts w:ascii="Hiragino Sans GB" w:hAnsi="Hiragino Sans GB" w:eastAsia="Hiragino Sans GB"/>
           <w:b w:val="0"/>
           <w:color w:val="182129"/>
           <w:sz w:val="21"/>
@@ -3479,7 +3534,7 @@
       </w:pPr>
       <w:r>
         <w:rPr>
-          <w:rFonts w:ascii="Arial Unicode MS" w:hAnsi="Arial Unicode MS" w:eastAsia="Arial Unicode MS"/>
+          <w:rFonts w:ascii="Hiragino Sans GB" w:hAnsi="Hiragino Sans GB" w:eastAsia="Hiragino Sans GB"/>
           <w:b/>
           <w:color w:val="1F4D78"/>
           <w:sz w:val="21"/>
@@ -3488,7 +3543,7 @@
       </w:r>
       <w:r>
         <w:rPr>
-          <w:rFonts w:ascii="Arial Unicode MS" w:hAnsi="Arial Unicode MS" w:eastAsia="Arial Unicode MS"/>
+          <w:rFonts w:ascii="Hiragino Sans GB" w:hAnsi="Hiragino Sans GB" w:eastAsia="Hiragino Sans GB"/>
           <w:color w:val="182129"/>
           <w:sz w:val="21"/>
         </w:rPr>
@@ -3511,7 +3566,7 @@
       </w:pPr>
       <w:r>
         <w:rPr>
-          <w:rFonts w:ascii="Arial Unicode MS" w:hAnsi="Arial Unicode MS" w:eastAsia="Arial Unicode MS"/>
+          <w:rFonts w:ascii="Hiragino Sans GB" w:hAnsi="Hiragino Sans GB" w:eastAsia="Hiragino Sans GB"/>
           <w:b/>
           <w:color w:val="007F82"/>
           <w:sz w:val="18"/>
@@ -3521,7 +3576,7 @@
       </w:r>
       <w:r>
         <w:rPr>
-          <w:rFonts w:ascii="Arial Unicode MS" w:hAnsi="Arial Unicode MS" w:eastAsia="Arial Unicode MS"/>
+          <w:rFonts w:ascii="Hiragino Sans GB" w:hAnsi="Hiragino Sans GB" w:eastAsia="Hiragino Sans GB"/>
           <w:b w:val="0"/>
           <w:color w:val="182129"/>
           <w:sz w:val="21"/>
@@ -3535,7 +3590,7 @@
       </w:pPr>
       <w:r>
         <w:rPr>
-          <w:rFonts w:ascii="Arial Unicode MS" w:hAnsi="Arial Unicode MS" w:eastAsia="Arial Unicode MS"/>
+          <w:rFonts w:ascii="Hiragino Sans GB" w:hAnsi="Hiragino Sans GB" w:eastAsia="Hiragino Sans GB"/>
           <w:b/>
           <w:color w:val="1F4D78"/>
           <w:sz w:val="21"/>
@@ -3544,7 +3599,7 @@
       </w:r>
       <w:r>
         <w:rPr>
-          <w:rFonts w:ascii="Arial Unicode MS" w:hAnsi="Arial Unicode MS" w:eastAsia="Arial Unicode MS"/>
+          <w:rFonts w:ascii="Hiragino Sans GB" w:hAnsi="Hiragino Sans GB" w:eastAsia="Hiragino Sans GB"/>
           <w:color w:val="182129"/>
           <w:sz w:val="21"/>
         </w:rPr>
@@ -3552,11 +3607,6 @@
       </w:r>
     </w:p>
     <w:p>
-      <w:r>
-        <w:br w:type="page"/>
-      </w:r>
-    </w:p>
-    <w:p>
       <w:pPr>
         <w:pStyle w:val="Heading2"/>
       </w:pPr>
@@ -3572,7 +3622,7 @@
       </w:pPr>
       <w:r>
         <w:rPr>
-          <w:rFonts w:ascii="Arial Unicode MS" w:hAnsi="Arial Unicode MS" w:eastAsia="Arial Unicode MS"/>
+          <w:rFonts w:ascii="Hiragino Sans GB" w:hAnsi="Hiragino Sans GB" w:eastAsia="Hiragino Sans GB"/>
           <w:b/>
           <w:color w:val="007F82"/>
           <w:sz w:val="18"/>
@@ -3582,7 +3632,7 @@
       </w:r>
       <w:r>
         <w:rPr>
-          <w:rFonts w:ascii="Arial Unicode MS" w:hAnsi="Arial Unicode MS" w:eastAsia="Arial Unicode MS"/>
+          <w:rFonts w:ascii="Hiragino Sans GB" w:hAnsi="Hiragino Sans GB" w:eastAsia="Hiragino Sans GB"/>
           <w:b w:val="0"/>
           <w:color w:val="182129"/>
           <w:sz w:val="21"/>
@@ -3596,7 +3646,7 @@
       </w:pPr>
       <w:r>
         <w:rPr>
-          <w:rFonts w:ascii="Arial Unicode MS" w:hAnsi="Arial Unicode MS" w:eastAsia="Arial Unicode MS"/>
+          <w:rFonts w:ascii="Hiragino Sans GB" w:hAnsi="Hiragino Sans GB" w:eastAsia="Hiragino Sans GB"/>
           <w:b/>
           <w:color w:val="1F4D78"/>
           <w:sz w:val="21"/>
@@ -3605,7 +3655,7 @@
       </w:r>
       <w:r>
         <w:rPr>
-          <w:rFonts w:ascii="Arial Unicode MS" w:hAnsi="Arial Unicode MS" w:eastAsia="Arial Unicode MS"/>
+          <w:rFonts w:ascii="Hiragino Sans GB" w:hAnsi="Hiragino Sans GB" w:eastAsia="Hiragino Sans GB"/>
           <w:color w:val="182129"/>
           <w:sz w:val="21"/>
         </w:rPr>
@@ -3615,6 +3665,7 @@
     <w:p>
       <w:pPr>
         <w:pStyle w:val="Heading2"/>
+        <w:pageBreakBefore/>
       </w:pPr>
       <w:r>
         <w:t>8. 模型最大的不足是什么？</w:t>
@@ -3628,7 +3679,7 @@
       </w:pPr>
       <w:r>
         <w:rPr>
-          <w:rFonts w:ascii="Arial Unicode MS" w:hAnsi="Arial Unicode MS" w:eastAsia="Arial Unicode MS"/>
+          <w:rFonts w:ascii="Hiragino Sans GB" w:hAnsi="Hiragino Sans GB" w:eastAsia="Hiragino Sans GB"/>
           <w:b/>
           <w:color w:val="007F82"/>
           <w:sz w:val="18"/>
@@ -3638,7 +3689,7 @@
       </w:r>
       <w:r>
         <w:rPr>
-          <w:rFonts w:ascii="Arial Unicode MS" w:hAnsi="Arial Unicode MS" w:eastAsia="Arial Unicode MS"/>
+          <w:rFonts w:ascii="Hiragino Sans GB" w:hAnsi="Hiragino Sans GB" w:eastAsia="Hiragino Sans GB"/>
           <w:b w:val="0"/>
           <w:color w:val="182129"/>
           <w:sz w:val="21"/>
@@ -3652,7 +3703,7 @@
       </w:pPr>
       <w:r>
         <w:rPr>
-          <w:rFonts w:ascii="Arial Unicode MS" w:hAnsi="Arial Unicode MS" w:eastAsia="Arial Unicode MS"/>
+          <w:rFonts w:ascii="Hiragino Sans GB" w:hAnsi="Hiragino Sans GB" w:eastAsia="Hiragino Sans GB"/>
           <w:b/>
           <w:color w:val="1F4D78"/>
           <w:sz w:val="21"/>
@@ -3661,7 +3712,7 @@
       </w:r>
       <w:r>
         <w:rPr>
-          <w:rFonts w:ascii="Arial Unicode MS" w:hAnsi="Arial Unicode MS" w:eastAsia="Arial Unicode MS"/>
+          <w:rFonts w:ascii="Hiragino Sans GB" w:hAnsi="Hiragino Sans GB" w:eastAsia="Hiragino Sans GB"/>
           <w:color w:val="182129"/>
           <w:sz w:val="21"/>
         </w:rPr>
@@ -3669,11 +3720,6 @@
       </w:r>
     </w:p>
     <w:p>
-      <w:r>
-        <w:br w:type="page"/>
-      </w:r>
-    </w:p>
-    <w:p>
       <w:pPr>
         <w:pStyle w:val="Heading2"/>
       </w:pPr>
@@ -3689,7 +3735,7 @@
       </w:pPr>
       <w:r>
         <w:rPr>
-          <w:rFonts w:ascii="Arial Unicode MS" w:hAnsi="Arial Unicode MS" w:eastAsia="Arial Unicode MS"/>
+          <w:rFonts w:ascii="Hiragino Sans GB" w:hAnsi="Hiragino Sans GB" w:eastAsia="Hiragino Sans GB"/>
           <w:b/>
           <w:color w:val="007F82"/>
           <w:sz w:val="18"/>
@@ -3699,7 +3745,7 @@
       </w:r>
       <w:r>
         <w:rPr>
-          <w:rFonts w:ascii="Arial Unicode MS" w:hAnsi="Arial Unicode MS" w:eastAsia="Arial Unicode MS"/>
+          <w:rFonts w:ascii="Hiragino Sans GB" w:hAnsi="Hiragino Sans GB" w:eastAsia="Hiragino Sans GB"/>
           <w:b w:val="0"/>
           <w:color w:val="182129"/>
           <w:sz w:val="21"/>
@@ -3713,7 +3759,7 @@
       </w:pPr>
       <w:r>
         <w:rPr>
-          <w:rFonts w:ascii="Arial Unicode MS" w:hAnsi="Arial Unicode MS" w:eastAsia="Arial Unicode MS"/>
+          <w:rFonts w:ascii="Hiragino Sans GB" w:hAnsi="Hiragino Sans GB" w:eastAsia="Hiragino Sans GB"/>
           <w:b/>
           <w:color w:val="1F4D78"/>
           <w:sz w:val="21"/>
@@ -3722,7 +3768,7 @@
       </w:r>
       <w:r>
         <w:rPr>
-          <w:rFonts w:ascii="Arial Unicode MS" w:hAnsi="Arial Unicode MS" w:eastAsia="Arial Unicode MS"/>
+          <w:rFonts w:ascii="Hiragino Sans GB" w:hAnsi="Hiragino Sans GB" w:eastAsia="Hiragino Sans GB"/>
           <w:color w:val="182129"/>
           <w:sz w:val="21"/>
         </w:rPr>
@@ -3745,7 +3791,7 @@
       </w:pPr>
       <w:r>
         <w:rPr>
-          <w:rFonts w:ascii="Arial Unicode MS" w:hAnsi="Arial Unicode MS" w:eastAsia="Arial Unicode MS"/>
+          <w:rFonts w:ascii="Hiragino Sans GB" w:hAnsi="Hiragino Sans GB" w:eastAsia="Hiragino Sans GB"/>
           <w:b/>
           <w:color w:val="007F82"/>
           <w:sz w:val="18"/>
@@ -3755,7 +3801,7 @@
       </w:r>
       <w:r>
         <w:rPr>
-          <w:rFonts w:ascii="Arial Unicode MS" w:hAnsi="Arial Unicode MS" w:eastAsia="Arial Unicode MS"/>
+          <w:rFonts w:ascii="Hiragino Sans GB" w:hAnsi="Hiragino Sans GB" w:eastAsia="Hiragino Sans GB"/>
           <w:b w:val="0"/>
           <w:color w:val="182129"/>
           <w:sz w:val="21"/>
@@ -3769,7 +3815,7 @@
       </w:pPr>
       <w:r>
         <w:rPr>
-          <w:rFonts w:ascii="Arial Unicode MS" w:hAnsi="Arial Unicode MS" w:eastAsia="Arial Unicode MS"/>
+          <w:rFonts w:ascii="Hiragino Sans GB" w:hAnsi="Hiragino Sans GB" w:eastAsia="Hiragino Sans GB"/>
           <w:b/>
           <w:color w:val="1F4D78"/>
           <w:sz w:val="21"/>
@@ -3778,7 +3824,7 @@
       </w:r>
       <w:r>
         <w:rPr>
-          <w:rFonts w:ascii="Arial Unicode MS" w:hAnsi="Arial Unicode MS" w:eastAsia="Arial Unicode MS"/>
+          <w:rFonts w:ascii="Hiragino Sans GB" w:hAnsi="Hiragino Sans GB" w:eastAsia="Hiragino Sans GB"/>
           <w:color w:val="182129"/>
           <w:sz w:val="21"/>
         </w:rPr>
@@ -3800,7 +3846,7 @@
       </w:pPr>
       <w:r>
         <w:rPr>
-          <w:rFonts w:ascii="Arial Unicode MS" w:hAnsi="Arial Unicode MS" w:eastAsia="Arial Unicode MS"/>
+          <w:rFonts w:ascii="Hiragino Sans GB" w:hAnsi="Hiragino Sans GB" w:eastAsia="Hiragino Sans GB"/>
           <w:color w:val="182129"/>
           <w:sz w:val="21"/>
         </w:rPr>
@@ -3814,7 +3860,7 @@
       </w:pPr>
       <w:r>
         <w:rPr>
-          <w:rFonts w:ascii="Arial Unicode MS" w:hAnsi="Arial Unicode MS" w:eastAsia="Arial Unicode MS"/>
+          <w:rFonts w:ascii="Hiragino Sans GB" w:hAnsi="Hiragino Sans GB" w:eastAsia="Hiragino Sans GB"/>
           <w:color w:val="182129"/>
           <w:sz w:val="21"/>
         </w:rPr>
@@ -3828,7 +3874,7 @@
       </w:pPr>
       <w:r>
         <w:rPr>
-          <w:rFonts w:ascii="Arial Unicode MS" w:hAnsi="Arial Unicode MS" w:eastAsia="Arial Unicode MS"/>
+          <w:rFonts w:ascii="Hiragino Sans GB" w:hAnsi="Hiragino Sans GB" w:eastAsia="Hiragino Sans GB"/>
           <w:color w:val="182129"/>
           <w:sz w:val="21"/>
         </w:rPr>
@@ -3842,7 +3888,7 @@
       </w:pPr>
       <w:r>
         <w:rPr>
-          <w:rFonts w:ascii="Arial Unicode MS" w:hAnsi="Arial Unicode MS" w:eastAsia="Arial Unicode MS"/>
+          <w:rFonts w:ascii="Hiragino Sans GB" w:hAnsi="Hiragino Sans GB" w:eastAsia="Hiragino Sans GB"/>
           <w:color w:val="182129"/>
           <w:sz w:val="21"/>
         </w:rPr>
@@ -3856,7 +3902,7 @@
       </w:pPr>
       <w:r>
         <w:rPr>
-          <w:rFonts w:ascii="Arial Unicode MS" w:hAnsi="Arial Unicode MS" w:eastAsia="Arial Unicode MS"/>
+          <w:rFonts w:ascii="Hiragino Sans GB" w:hAnsi="Hiragino Sans GB" w:eastAsia="Hiragino Sans GB"/>
           <w:color w:val="182129"/>
           <w:sz w:val="21"/>
         </w:rPr>
@@ -3870,7 +3916,7 @@
       </w:pPr>
       <w:r>
         <w:rPr>
-          <w:rFonts w:ascii="Arial Unicode MS" w:hAnsi="Arial Unicode MS" w:eastAsia="Arial Unicode MS"/>
+          <w:rFonts w:ascii="Hiragino Sans GB" w:hAnsi="Hiragino Sans GB" w:eastAsia="Hiragino Sans GB"/>
           <w:color w:val="182129"/>
           <w:sz w:val="21"/>
         </w:rPr>
@@ -3898,7 +3944,7 @@
     </w:pPr>
     <w:r>
       <w:rPr>
-        <w:rFonts w:ascii="Arial Unicode MS" w:hAnsi="Arial Unicode MS" w:eastAsia="Arial Unicode MS"/>
+        <w:rFonts w:ascii="Hiragino Sans GB" w:hAnsi="Hiragino Sans GB" w:eastAsia="Hiragino Sans GB"/>
         <w:color w:val="57626E"/>
         <w:sz w:val="17"/>
       </w:rPr>
@@ -3906,7 +3952,7 @@
     </w:r>
     <w:r>
       <w:rPr>
-        <w:rFonts w:ascii="Calibri" w:hAnsi="Calibri" w:eastAsia="Arial Unicode MS"/>
+        <w:rFonts w:ascii="Arial" w:hAnsi="Arial" w:eastAsia="Hiragino Sans GB"/>
         <w:color w:val="57626E"/>
         <w:sz w:val="18"/>
       </w:rPr>
@@ -3927,7 +3973,7 @@
     </w:pPr>
     <w:r>
       <w:rPr>
-        <w:rFonts w:ascii="Calibri" w:hAnsi="Calibri" w:eastAsia="Arial Unicode MS"/>
+        <w:rFonts w:ascii="Arial" w:hAnsi="Arial" w:eastAsia="Hiragino Sans GB"/>
         <w:b/>
         <w:color w:val="57626E"/>
         <w:sz w:val="17"/>
@@ -4306,7 +4352,7 @@
       <w:spacing w:before="0" w:after="100" w:line="293" w:lineRule="auto"/>
     </w:pPr>
     <w:rPr>
-      <w:rFonts w:ascii="Arial Unicode MS" w:hAnsi="Arial Unicode MS" w:eastAsia="Arial Unicode MS"/>
+      <w:rFonts w:ascii="Arial" w:hAnsi="Arial" w:eastAsia="Hiragino Sans GB"/>
       <w:color w:val="182129"/>
       <w:sz w:val="21"/>
     </w:rPr>
@@ -4370,7 +4416,7 @@
       <w:outlineLvl w:val="0"/>
     </w:pPr>
     <w:rPr>
-      <w:rFonts w:asciiTheme="majorHAnsi" w:eastAsiaTheme="majorEastAsia" w:hAnsiTheme="majorHAnsi" w:cstheme="majorBidi" w:ascii="Arial Unicode MS" w:hAnsi="Arial Unicode MS" w:eastAsia="Arial Unicode MS"/>
+      <w:rFonts w:asciiTheme="majorHAnsi" w:eastAsiaTheme="majorEastAsia" w:hAnsiTheme="majorHAnsi" w:cstheme="majorBidi" w:ascii="Arial" w:hAnsi="Arial" w:eastAsia="Hiragino Sans GB"/>
       <w:b/>
       <w:bCs/>
       <w:color w:val="2E74B5"/>
@@ -4394,7 +4440,7 @@
       <w:outlineLvl w:val="1"/>
     </w:pPr>
     <w:rPr>
-      <w:rFonts w:asciiTheme="majorHAnsi" w:eastAsiaTheme="majorEastAsia" w:hAnsiTheme="majorHAnsi" w:cstheme="majorBidi" w:ascii="Arial Unicode MS" w:hAnsi="Arial Unicode MS" w:eastAsia="Arial Unicode MS"/>
+      <w:rFonts w:asciiTheme="majorHAnsi" w:eastAsiaTheme="majorEastAsia" w:hAnsiTheme="majorHAnsi" w:cstheme="majorBidi" w:ascii="Arial" w:hAnsi="Arial" w:eastAsia="Hiragino Sans GB"/>
       <w:b/>
       <w:bCs/>
       <w:color w:val="2E74B5"/>
@@ -4418,7 +4464,7 @@
       <w:outlineLvl w:val="2"/>
     </w:pPr>
     <w:rPr>
-      <w:rFonts w:asciiTheme="majorHAnsi" w:eastAsiaTheme="majorEastAsia" w:hAnsiTheme="majorHAnsi" w:cstheme="majorBidi" w:ascii="Arial Unicode MS" w:hAnsi="Arial Unicode MS" w:eastAsia="Arial Unicode MS"/>
+      <w:rFonts w:asciiTheme="majorHAnsi" w:eastAsiaTheme="majorEastAsia" w:hAnsiTheme="majorHAnsi" w:cstheme="majorBidi" w:ascii="Arial" w:hAnsi="Arial" w:eastAsia="Hiragino Sans GB"/>
       <w:b/>
       <w:bCs/>
       <w:color w:val="1F4D78"/>
@@ -27842,74 +27888,74 @@
     </a:clrScheme>
     <a:fontScheme name="Office">
       <a:majorFont>
-        <a:latin typeface="Calibri"/>
-        <a:ea typeface=""/>
-        <a:cs typeface=""/>
-        <a:font script="Jpan" typeface="ＭＳ ゴシック"/>
-        <a:font script="Hang" typeface="맑은 고딕"/>
-        <a:font script="Hans" typeface="宋体"/>
-        <a:font script="Hant" typeface="新細明體"/>
-        <a:font script="Arab" typeface="Times New Roman"/>
-        <a:font script="Hebr" typeface="Times New Roman"/>
-        <a:font script="Thai" typeface="Angsana New"/>
-        <a:font script="Ethi" typeface="Nyala"/>
-        <a:font script="Beng" typeface="Vrinda"/>
-        <a:font script="Gujr" typeface="Shruti"/>
-        <a:font script="Khmr" typeface="MoolBoran"/>
-        <a:font script="Knda" typeface="Tunga"/>
-        <a:font script="Guru" typeface="Raavi"/>
-        <a:font script="Cans" typeface="Euphemia"/>
-        <a:font script="Cher" typeface="Plantagenet Cherokee"/>
-        <a:font script="Yiii" typeface="Microsoft Yi Baiti"/>
-        <a:font script="Tibt" typeface="Microsoft Himalaya"/>
-        <a:font script="Thaa" typeface="MV Boli"/>
-        <a:font script="Deva" typeface="Mangal"/>
-        <a:font script="Telu" typeface="Gautami"/>
-        <a:font script="Taml" typeface="Latha"/>
-        <a:font script="Syrc" typeface="Estrangelo Edessa"/>
-        <a:font script="Orya" typeface="Kalinga"/>
-        <a:font script="Mlym" typeface="Kartika"/>
-        <a:font script="Laoo" typeface="DokChampa"/>
-        <a:font script="Sinh" typeface="Iskoola Pota"/>
-        <a:font script="Mong" typeface="Mongolian Baiti"/>
-        <a:font script="Viet" typeface="Times New Roman"/>
-        <a:font script="Uigh" typeface="Microsoft Uighur"/>
-        <a:font script="Geor" typeface="Sylfaen"/>
+        <a:latin typeface="Arial"/>
+        <a:ea typeface="Arial"/>
+        <a:cs typeface="Arial"/>
+        <a:font script="Jpan" typeface="Arial"/>
+        <a:font script="Hang" typeface="Arial"/>
+        <a:font script="Hans" typeface="Arial"/>
+        <a:font script="Hant" typeface="Arial"/>
+        <a:font script="Arab" typeface="Arial"/>
+        <a:font script="Hebr" typeface="Arial"/>
+        <a:font script="Thai" typeface="Arial"/>
+        <a:font script="Ethi" typeface="Arial"/>
+        <a:font script="Beng" typeface="Arial"/>
+        <a:font script="Gujr" typeface="Arial"/>
+        <a:font script="Khmr" typeface="Arial"/>
+        <a:font script="Knda" typeface="Arial"/>
+        <a:font script="Guru" typeface="Arial"/>
+        <a:font script="Cans" typeface="Arial"/>
+        <a:font script="Cher" typeface="Arial"/>
+        <a:font script="Yiii" typeface="Arial"/>
+        <a:font script="Tibt" typeface="Arial"/>
+        <a:font script="Thaa" typeface="Arial"/>
+        <a:font script="Deva" typeface="Arial"/>
+        <a:font script="Telu" typeface="Arial"/>
+        <a:font script="Taml" typeface="Arial"/>
+        <a:font script="Syrc" typeface="Arial"/>
+        <a:font script="Orya" typeface="Arial"/>
+        <a:font script="Mlym" typeface="Arial"/>
+        <a:font script="Laoo" typeface="Arial"/>
+        <a:font script="Sinh" typeface="Arial"/>
+        <a:font script="Mong" typeface="Arial"/>
+        <a:font script="Viet" typeface="Arial"/>
+        <a:font script="Uigh" typeface="Arial"/>
+        <a:font script="Geor" typeface="Arial"/>
       </a:majorFont>
       <a:minorFont>
-        <a:latin typeface="Cambria"/>
-        <a:ea typeface=""/>
-        <a:cs typeface=""/>
-        <a:font script="Jpan" typeface="ＭＳ 明朝"/>
-        <a:font script="Hang" typeface="맑은 고딕"/>
-        <a:font script="Hans" typeface="宋体"/>
-        <a:font script="Hant" typeface="新細明體"/>
+        <a:latin typeface="Arial"/>
+        <a:ea typeface="Arial"/>
+        <a:cs typeface="Arial"/>
+        <a:font script="Jpan" typeface="Arial"/>
+        <a:font script="Hang" typeface="Arial"/>
+        <a:font script="Hans" typeface="Arial"/>
+        <a:font script="Hant" typeface="Arial"/>
         <a:font script="Arab" typeface="Arial"/>
         <a:font script="Hebr" typeface="Arial"/>
-        <a:font script="Thai" typeface="Cordia New"/>
-        <a:font script="Ethi" typeface="Nyala"/>
-        <a:font script="Beng" typeface="Vrinda"/>
-        <a:font script="Gujr" typeface="Shruti"/>
-        <a:font script="Khmr" typeface="DaunPenh"/>
-        <a:font script="Knda" typeface="Tunga"/>
-        <a:font script="Guru" typeface="Raavi"/>
-        <a:font script="Cans" typeface="Euphemia"/>
-        <a:font script="Cher" typeface="Plantagenet Cherokee"/>
-        <a:font script="Yiii" typeface="Microsoft Yi Baiti"/>
-        <a:font script="Tibt" typeface="Microsoft Himalaya"/>
-        <a:font script="Thaa" typeface="MV Boli"/>
-        <a:font script="Deva" typeface="Mangal"/>
-        <a:font script="Telu" typeface="Gautami"/>
-        <a:font script="Taml" typeface="Latha"/>
-        <a:font script="Syrc" typeface="Estrangelo Edessa"/>
-        <a:font script="Orya" typeface="Kalinga"/>
-        <a:font script="Mlym" typeface="Kartika"/>
-        <a:font script="Laoo" typeface="DokChampa"/>
-        <a:font script="Sinh" typeface="Iskoola Pota"/>
-        <a:font script="Mong" typeface="Mongolian Baiti"/>
+        <a:font script="Thai" typeface="Arial"/>
+        <a:font script="Ethi" typeface="Arial"/>
+        <a:font script="Beng" typeface="Arial"/>
+        <a:font script="Gujr" typeface="Arial"/>
+        <a:font script="Khmr" typeface="Arial"/>
+        <a:font script="Knda" typeface="Arial"/>
+        <a:font script="Guru" typeface="Arial"/>
+        <a:font script="Cans" typeface="Arial"/>
+        <a:font script="Cher" typeface="Arial"/>
+        <a:font script="Yiii" typeface="Arial"/>
+        <a:font script="Tibt" typeface="Arial"/>
+        <a:font script="Thaa" typeface="Arial"/>
+        <a:font script="Deva" typeface="Arial"/>
+        <a:font script="Telu" typeface="Arial"/>
+        <a:font script="Taml" typeface="Arial"/>
+        <a:font script="Syrc" typeface="Arial"/>
+        <a:font script="Orya" typeface="Arial"/>
+        <a:font script="Mlym" typeface="Arial"/>
+        <a:font script="Laoo" typeface="Arial"/>
+        <a:font script="Sinh" typeface="Arial"/>
+        <a:font script="Mong" typeface="Arial"/>
         <a:font script="Viet" typeface="Arial"/>
-        <a:font script="Uigh" typeface="Microsoft Uighur"/>
-        <a:font script="Geor" typeface="Sylfaen"/>
+        <a:font script="Uigh" typeface="Arial"/>
+        <a:font script="Geor" typeface="Arial"/>
       </a:minorFont>
     </a:fontScheme>
     <a:fmtScheme name="Office">

</xml_diff>